<commit_message>
Binary Search: Added questions for different Levels
</commit_message>
<xml_diff>
--- a/08. Binary Search/Binary Search.docx
+++ b/08. Binary Search/Binary Search.docx
@@ -2182,16 +2182,364 @@
       </w:pPr>
     </w:p>
     <w:p>
-      <w:pPr>
-        <w:spacing w:after="0"/>
-        <w:ind w:left="720"/>
-        <w:rPr>
-          <w:rFonts w:asciiTheme="majorHAnsi" w:hAnsiTheme="majorHAnsi" w:cstheme="majorHAnsi"/>
-          <w:color w:val="1F4E79" w:themeColor="accent5" w:themeShade="80"/>
+      <w:bookmarkStart w:id="8" w:name="_GoBack"/>
+      <w:bookmarkEnd w:id="8"/>
+    </w:p>
+    <w:p>
+      <w:pPr>
+        <w:rPr>
+          <w:b/>
           <w:sz w:val="24"/>
-          <w:szCs w:val="24"/>
-        </w:rPr>
-      </w:pPr>
+        </w:rPr>
+      </w:pPr>
+      <w:r>
+        <w:rPr>
+          <w:b/>
+          <w:sz w:val="24"/>
+        </w:rPr>
+        <w:t>Level 1 — Foundations (classic binary search on sorted arrays)</w:t>
+      </w:r>
+    </w:p>
+    <w:p>
+      <w:pPr>
+        <w:numPr>
+          <w:ilvl w:val="0"/>
+          <w:numId w:val="10"/>
+        </w:numPr>
+        <w:spacing w:before="100" w:beforeAutospacing="1" w:after="100" w:afterAutospacing="1" w:line="240" w:lineRule="auto"/>
+      </w:pPr>
+      <w:r>
+        <w:rPr>
+          <w:rStyle w:val="Strong"/>
+        </w:rPr>
+        <w:t>First Bad Version</w:t>
+      </w:r>
+      <w:r>
+        <w:t xml:space="preserve"> (LC 278)</w:t>
+      </w:r>
+    </w:p>
+    <w:p>
+      <w:pPr>
+        <w:numPr>
+          <w:ilvl w:val="0"/>
+          <w:numId w:val="10"/>
+        </w:numPr>
+        <w:spacing w:before="100" w:beforeAutospacing="1" w:after="100" w:afterAutospacing="1" w:line="240" w:lineRule="auto"/>
+      </w:pPr>
+      <w:r>
+        <w:rPr>
+          <w:rStyle w:val="Strong"/>
+        </w:rPr>
+        <w:t>Check If N and Its Double Exist</w:t>
+      </w:r>
+      <w:r>
+        <w:t xml:space="preserve"> (LC 1346) — binary search variant on lookup</w:t>
+      </w:r>
+    </w:p>
+    <w:p>
+      <w:pPr>
+        <w:pStyle w:val="ListParagraph"/>
+        <w:numPr>
+          <w:ilvl w:val="0"/>
+          <w:numId w:val="13"/>
+        </w:numPr>
+      </w:pPr>
+      <w:r>
+        <w:t>Binary Search (704)</w:t>
+      </w:r>
+      <w:r>
+        <w:tab/>
+      </w:r>
+      <w:proofErr w:type="spellStart"/>
+      <w:r>
+        <w:t>LeetCode</w:t>
+      </w:r>
+      <w:proofErr w:type="spellEnd"/>
+      <w:r>
+        <w:tab/>
+        <w:t>Easy</w:t>
+      </w:r>
+    </w:p>
+    <w:p>
+      <w:pPr>
+        <w:pStyle w:val="ListParagraph"/>
+        <w:numPr>
+          <w:ilvl w:val="0"/>
+          <w:numId w:val="13"/>
+        </w:numPr>
+      </w:pPr>
+      <w:r>
+        <w:t>Search Insert Position (35)</w:t>
+      </w:r>
+      <w:r>
+        <w:tab/>
+      </w:r>
+      <w:proofErr w:type="spellStart"/>
+      <w:r>
+        <w:t>LeetCode</w:t>
+      </w:r>
+      <w:proofErr w:type="spellEnd"/>
+      <w:r>
+        <w:tab/>
+        <w:t>Easy</w:t>
+      </w:r>
+    </w:p>
+    <w:p>
+      <w:pPr>
+        <w:pStyle w:val="ListParagraph"/>
+        <w:numPr>
+          <w:ilvl w:val="0"/>
+          <w:numId w:val="13"/>
+        </w:numPr>
+      </w:pPr>
+      <w:r>
+        <w:t>Guess Number Higher or Lower (374)</w:t>
+      </w:r>
+      <w:r>
+        <w:tab/>
+      </w:r>
+      <w:proofErr w:type="spellStart"/>
+      <w:r>
+        <w:t>LeetCode</w:t>
+      </w:r>
+      <w:proofErr w:type="spellEnd"/>
+      <w:r>
+        <w:tab/>
+        <w:t>Easy</w:t>
+      </w:r>
+    </w:p>
+    <w:p>
+      <w:pPr>
+        <w:pStyle w:val="ListParagraph"/>
+        <w:numPr>
+          <w:ilvl w:val="0"/>
+          <w:numId w:val="13"/>
+        </w:numPr>
+      </w:pPr>
+      <w:r>
+        <w:t>Valid Perfect Square (367)</w:t>
+      </w:r>
+      <w:r>
+        <w:tab/>
+      </w:r>
+      <w:proofErr w:type="spellStart"/>
+      <w:r>
+        <w:t>LeetCode</w:t>
+      </w:r>
+      <w:proofErr w:type="spellEnd"/>
+      <w:r>
+        <w:tab/>
+        <w:t>Easy</w:t>
+      </w:r>
+    </w:p>
+    <w:p>
+      <w:pPr>
+        <w:pStyle w:val="ListParagraph"/>
+        <w:numPr>
+          <w:ilvl w:val="0"/>
+          <w:numId w:val="13"/>
+        </w:numPr>
+      </w:pPr>
+      <w:proofErr w:type="spellStart"/>
+      <w:r>
+        <w:t>Sqrt</w:t>
+      </w:r>
+      <w:proofErr w:type="spellEnd"/>
+      <w:r>
+        <w:t>(x) (69)</w:t>
+      </w:r>
+      <w:r>
+        <w:tab/>
+      </w:r>
+      <w:proofErr w:type="spellStart"/>
+      <w:r>
+        <w:t>LeetCode</w:t>
+      </w:r>
+      <w:proofErr w:type="spellEnd"/>
+      <w:r>
+        <w:tab/>
+        <w:t>Easy</w:t>
+      </w:r>
+    </w:p>
+    <w:p>
+      <w:pPr>
+        <w:pStyle w:val="ListParagraph"/>
+        <w:numPr>
+          <w:ilvl w:val="0"/>
+          <w:numId w:val="13"/>
+        </w:numPr>
+      </w:pPr>
+      <w:r>
+        <w:t>Find First and Last Position of Element in Sorted Array (34)</w:t>
+      </w:r>
+      <w:r>
+        <w:tab/>
+      </w:r>
+      <w:proofErr w:type="spellStart"/>
+      <w:r>
+        <w:t>LeetCode</w:t>
+      </w:r>
+      <w:proofErr w:type="spellEnd"/>
+    </w:p>
+    <w:p>
+      <w:pPr>
+        <w:pStyle w:val="ListParagraph"/>
+        <w:numPr>
+          <w:ilvl w:val="0"/>
+          <w:numId w:val="13"/>
+        </w:numPr>
+      </w:pPr>
+      <w:r>
+        <w:t>Search Insert Position (35)</w:t>
+      </w:r>
+      <w:r>
+        <w:tab/>
+      </w:r>
+      <w:proofErr w:type="spellStart"/>
+      <w:r>
+        <w:t>LeetCode</w:t>
+      </w:r>
+      <w:proofErr w:type="spellEnd"/>
+    </w:p>
+    <w:p>
+      <w:pPr>
+        <w:pStyle w:val="ListParagraph"/>
+        <w:numPr>
+          <w:ilvl w:val="0"/>
+          <w:numId w:val="13"/>
+        </w:numPr>
+      </w:pPr>
+      <w:r>
+        <w:t>Find Smallest Letter Greater Than Target (744)</w:t>
+      </w:r>
+      <w:r>
+        <w:tab/>
+      </w:r>
+      <w:proofErr w:type="spellStart"/>
+      <w:r>
+        <w:t>LeetCode</w:t>
+      </w:r>
+      <w:proofErr w:type="spellEnd"/>
+    </w:p>
+    <w:p>
+      <w:pPr>
+        <w:pStyle w:val="ListParagraph"/>
+        <w:numPr>
+          <w:ilvl w:val="0"/>
+          <w:numId w:val="13"/>
+        </w:numPr>
+      </w:pPr>
+      <w:r>
+        <w:t>Search Insert Position (35)</w:t>
+      </w:r>
+      <w:r>
+        <w:tab/>
+      </w:r>
+      <w:proofErr w:type="spellStart"/>
+      <w:r>
+        <w:t>LeetCode</w:t>
+      </w:r>
+      <w:proofErr w:type="spellEnd"/>
+    </w:p>
+    <w:p>
+      <w:pPr>
+        <w:pStyle w:val="ListParagraph"/>
+        <w:numPr>
+          <w:ilvl w:val="0"/>
+          <w:numId w:val="13"/>
+        </w:numPr>
+      </w:pPr>
+      <w:r>
+        <w:t>Find First and Last Position (34)</w:t>
+      </w:r>
+      <w:r>
+        <w:tab/>
+      </w:r>
+      <w:proofErr w:type="spellStart"/>
+      <w:r>
+        <w:t>LeetCode</w:t>
+      </w:r>
+      <w:proofErr w:type="spellEnd"/>
+    </w:p>
+    <w:p>
+      <w:pPr>
+        <w:pStyle w:val="ListParagraph"/>
+        <w:numPr>
+          <w:ilvl w:val="0"/>
+          <w:numId w:val="13"/>
+        </w:numPr>
+      </w:pPr>
+      <w:r>
+        <w:t>Snapshot Array (1146) (Binary Search application)</w:t>
+      </w:r>
+      <w:r>
+        <w:tab/>
+      </w:r>
+      <w:proofErr w:type="spellStart"/>
+      <w:r>
+        <w:t>LeetCode</w:t>
+      </w:r>
+      <w:proofErr w:type="spellEnd"/>
+    </w:p>
+    <w:p>
+      <w:pPr>
+        <w:pStyle w:val="ListParagraph"/>
+        <w:numPr>
+          <w:ilvl w:val="0"/>
+          <w:numId w:val="13"/>
+        </w:numPr>
+      </w:pPr>
+      <w:r>
+        <w:t>Peak Index in a Mountain Array (852)</w:t>
+      </w:r>
+      <w:r>
+        <w:tab/>
+      </w:r>
+      <w:proofErr w:type="spellStart"/>
+      <w:r>
+        <w:t>LeetCode</w:t>
+      </w:r>
+      <w:proofErr w:type="spellEnd"/>
+    </w:p>
+    <w:p>
+      <w:pPr>
+        <w:pStyle w:val="ListParagraph"/>
+        <w:numPr>
+          <w:ilvl w:val="0"/>
+          <w:numId w:val="13"/>
+        </w:numPr>
+      </w:pPr>
+      <w:r>
+        <w:t>Find Peak Element (162)</w:t>
+      </w:r>
+      <w:r>
+        <w:tab/>
+      </w:r>
+      <w:proofErr w:type="spellStart"/>
+      <w:r>
+        <w:t>LeetCode</w:t>
+      </w:r>
+      <w:proofErr w:type="spellEnd"/>
+    </w:p>
+    <w:p>
+      <w:pPr>
+        <w:pStyle w:val="ListParagraph"/>
+        <w:numPr>
+          <w:ilvl w:val="0"/>
+          <w:numId w:val="13"/>
+        </w:numPr>
+      </w:pPr>
+      <w:r>
+        <w:t>Count Occurrences in Sorted Array</w:t>
+      </w:r>
+      <w:r>
+        <w:tab/>
+      </w:r>
+      <w:proofErr w:type="spellStart"/>
+      <w:r>
+        <w:t>GeeksforGeeks</w:t>
+      </w:r>
+      <w:proofErr w:type="spellEnd"/>
     </w:p>
     <w:p/>
     <w:p>
@@ -2209,6 +2557,7 @@
         </w:rPr>
       </w:pPr>
       <w:r>
+        <w:lastRenderedPageBreak/>
         <w:br w:type="page"/>
       </w:r>
     </w:p>
@@ -2222,7 +2571,7 @@
           <w:sz w:val="40"/>
         </w:rPr>
       </w:pPr>
-      <w:bookmarkStart w:id="8" w:name="_Toc207697052"/>
+      <w:bookmarkStart w:id="9" w:name="_Toc207697052"/>
       <w:r>
         <w:rPr>
           <w:rFonts w:cstheme="majorHAnsi"/>
@@ -2249,7 +2598,7 @@
         </w:rPr>
         <w:t>Pro</w:t>
       </w:r>
-      <w:bookmarkEnd w:id="8"/>
+      <w:bookmarkEnd w:id="9"/>
     </w:p>
     <w:p>
       <w:pPr>
@@ -2276,7 +2625,7 @@
           <w:color w:val="1F4E79" w:themeColor="accent5" w:themeShade="80"/>
         </w:rPr>
       </w:pPr>
-      <w:bookmarkStart w:id="9" w:name="_Toc207697053"/>
+      <w:bookmarkStart w:id="10" w:name="_Toc207697053"/>
       <w:r>
         <w:rPr>
           <w:rFonts w:cstheme="majorHAnsi"/>
@@ -2284,7 +2633,7 @@
         </w:rPr>
         <w:t>Find Peak Element</w:t>
       </w:r>
-      <w:bookmarkEnd w:id="9"/>
+      <w:bookmarkEnd w:id="10"/>
       <w:r>
         <w:rPr>
           <w:rFonts w:cstheme="majorHAnsi"/>
@@ -2353,7 +2702,7 @@
           <w:color w:val="1F4E79" w:themeColor="accent5" w:themeShade="80"/>
         </w:rPr>
       </w:pPr>
-      <w:bookmarkStart w:id="10" w:name="_Toc207697054"/>
+      <w:bookmarkStart w:id="11" w:name="_Toc207697054"/>
       <w:r>
         <w:rPr>
           <w:rFonts w:cstheme="majorHAnsi"/>
@@ -2361,7 +2710,7 @@
         </w:rPr>
         <w:t>Search in 2D matrix</w:t>
       </w:r>
-      <w:bookmarkEnd w:id="10"/>
+      <w:bookmarkEnd w:id="11"/>
     </w:p>
     <w:p>
       <w:pPr>
@@ -2423,7 +2772,7 @@
           <w:color w:val="1F4E79" w:themeColor="accent5" w:themeShade="80"/>
         </w:rPr>
       </w:pPr>
-      <w:bookmarkStart w:id="11" w:name="_Toc207697055"/>
+      <w:bookmarkStart w:id="12" w:name="_Toc207697055"/>
       <w:r>
         <w:rPr>
           <w:rFonts w:cstheme="majorHAnsi"/>
@@ -2431,7 +2780,7 @@
         </w:rPr>
         <w:t>Allocate Minimum number of pages</w:t>
       </w:r>
-      <w:bookmarkEnd w:id="11"/>
+      <w:bookmarkEnd w:id="12"/>
     </w:p>
     <w:p>
       <w:pPr>
@@ -2491,7 +2840,7 @@
           <w:color w:val="1F4E79" w:themeColor="accent5" w:themeShade="80"/>
         </w:rPr>
       </w:pPr>
-      <w:bookmarkStart w:id="12" w:name="_Toc207697056"/>
+      <w:bookmarkStart w:id="13" w:name="_Toc207697056"/>
       <w:r>
         <w:rPr>
           <w:rFonts w:cstheme="majorHAnsi"/>
@@ -2499,7 +2848,7 @@
         </w:rPr>
         <w:t>Koko Eating Bananas</w:t>
       </w:r>
-      <w:bookmarkEnd w:id="12"/>
+      <w:bookmarkEnd w:id="13"/>
     </w:p>
     <w:p>
       <w:pPr>
@@ -2662,9 +3011,6 @@
     <w:p/>
     <w:p/>
     <w:p/>
-    <w:p/>
-    <w:p/>
-    <w:p/>
     <w:p>
       <w:pPr>
         <w:pStyle w:val="Heading1"/>
@@ -2677,13 +3023,14 @@
           <w:u w:val="single"/>
         </w:rPr>
       </w:pPr>
-      <w:bookmarkStart w:id="13" w:name="_Toc138608496"/>
-      <w:bookmarkStart w:id="14" w:name="_Toc207697057"/>
+      <w:bookmarkStart w:id="14" w:name="_Toc138608496"/>
+      <w:bookmarkStart w:id="15" w:name="_Toc207697057"/>
       <w:r>
         <w:rPr>
           <w:rFonts w:cstheme="majorHAnsi"/>
           <w:sz w:val="40"/>
         </w:rPr>
+        <w:lastRenderedPageBreak/>
         <w:t>LEVEL 3:</w:t>
       </w:r>
       <w:r>
@@ -2694,7 +3041,7 @@
         </w:rPr>
         <w:t xml:space="preserve"> </w:t>
       </w:r>
-      <w:bookmarkEnd w:id="13"/>
+      <w:bookmarkEnd w:id="14"/>
       <w:r>
         <w:rPr>
           <w:rFonts w:cstheme="majorHAnsi"/>
@@ -2705,10 +3052,1089 @@
         </w:rPr>
         <w:t>Legend</w:t>
       </w:r>
-      <w:bookmarkEnd w:id="14"/>
-    </w:p>
-    <w:p>
-      <w:pPr>
+      <w:bookmarkEnd w:id="15"/>
+    </w:p>
+    <w:p/>
+    <w:p>
+      <w:pPr>
+        <w:spacing w:before="100" w:beforeAutospacing="1" w:after="100" w:afterAutospacing="1" w:line="240" w:lineRule="auto"/>
+      </w:pPr>
+    </w:p>
+    <w:p>
+      <w:pPr>
+        <w:spacing w:before="100" w:beforeAutospacing="1" w:after="100" w:afterAutospacing="1" w:line="240" w:lineRule="auto"/>
+      </w:pPr>
+    </w:p>
+    <w:p>
+      <w:pPr>
+        <w:spacing w:before="100" w:beforeAutospacing="1" w:after="100" w:afterAutospacing="1" w:line="240" w:lineRule="auto"/>
+      </w:pPr>
+    </w:p>
+    <w:p>
+      <w:pPr>
+        <w:spacing w:before="100" w:beforeAutospacing="1" w:after="100" w:afterAutospacing="1" w:line="240" w:lineRule="auto"/>
+      </w:pPr>
+    </w:p>
+    <w:p>
+      <w:pPr>
+        <w:spacing w:before="100" w:beforeAutospacing="1" w:after="100" w:afterAutospacing="1" w:line="240" w:lineRule="auto"/>
+      </w:pPr>
+    </w:p>
+    <w:p>
+      <w:pPr>
+        <w:spacing w:before="100" w:beforeAutospacing="1" w:after="100" w:afterAutospacing="1" w:line="240" w:lineRule="auto"/>
+      </w:pPr>
+    </w:p>
+    <w:p>
+      <w:pPr>
+        <w:spacing w:before="100" w:beforeAutospacing="1" w:after="100" w:afterAutospacing="1" w:line="240" w:lineRule="auto"/>
+      </w:pPr>
+    </w:p>
+    <w:p>
+      <w:pPr>
+        <w:spacing w:before="100" w:beforeAutospacing="1" w:after="100" w:afterAutospacing="1" w:line="240" w:lineRule="auto"/>
+      </w:pPr>
+    </w:p>
+    <w:p>
+      <w:pPr>
+        <w:spacing w:before="100" w:beforeAutospacing="1" w:after="100" w:afterAutospacing="1" w:line="240" w:lineRule="auto"/>
+      </w:pPr>
+    </w:p>
+    <w:p>
+      <w:pPr>
+        <w:spacing w:before="100" w:beforeAutospacing="1" w:after="100" w:afterAutospacing="1" w:line="240" w:lineRule="auto"/>
+      </w:pPr>
+    </w:p>
+    <w:p>
+      <w:pPr>
+        <w:spacing w:before="100" w:beforeAutospacing="1" w:after="100" w:afterAutospacing="1" w:line="240" w:lineRule="auto"/>
+      </w:pPr>
+    </w:p>
+    <w:p>
+      <w:pPr>
+        <w:spacing w:before="100" w:beforeAutospacing="1" w:after="100" w:afterAutospacing="1" w:line="240" w:lineRule="auto"/>
+      </w:pPr>
+    </w:p>
+    <w:p>
+      <w:pPr>
+        <w:spacing w:before="100" w:beforeAutospacing="1" w:after="100" w:afterAutospacing="1" w:line="240" w:lineRule="auto"/>
+      </w:pPr>
+    </w:p>
+    <w:p>
+      <w:pPr>
+        <w:spacing w:before="100" w:beforeAutospacing="1" w:after="100" w:afterAutospacing="1" w:line="240" w:lineRule="auto"/>
+      </w:pPr>
+    </w:p>
+    <w:p>
+      <w:pPr>
+        <w:rPr>
+          <w:b/>
+        </w:rPr>
+      </w:pPr>
+      <w:r>
+        <w:rPr>
+          <w:b/>
+          <w:sz w:val="24"/>
+        </w:rPr>
+        <w:t>Level 2 — Applied (rotated arrays, 2D matrices, boundary-finding)</w:t>
+      </w:r>
+    </w:p>
+    <w:p>
+      <w:pPr>
+        <w:numPr>
+          <w:ilvl w:val="0"/>
+          <w:numId w:val="11"/>
+        </w:numPr>
+        <w:spacing w:before="100" w:beforeAutospacing="1" w:after="100" w:afterAutospacing="1" w:line="240" w:lineRule="auto"/>
+      </w:pPr>
+      <w:r>
+        <w:rPr>
+          <w:rStyle w:val="Strong"/>
+        </w:rPr>
+        <w:t>Time Based Key-Value Store</w:t>
+      </w:r>
+      <w:r>
+        <w:t xml:space="preserve"> (LC 981) — binary search inside a </w:t>
+      </w:r>
+      <w:proofErr w:type="spellStart"/>
+      <w:r>
+        <w:t>hashmap</w:t>
+      </w:r>
+      <w:proofErr w:type="spellEnd"/>
+      <w:r>
+        <w:t>-of-lists design, confirmed as a recurring FAANG variant</w:t>
+      </w:r>
+    </w:p>
+    <w:p>
+      <w:pPr>
+        <w:numPr>
+          <w:ilvl w:val="0"/>
+          <w:numId w:val="11"/>
+        </w:numPr>
+        <w:spacing w:before="100" w:beforeAutospacing="1" w:after="100" w:afterAutospacing="1" w:line="240" w:lineRule="auto"/>
+      </w:pPr>
+      <w:r>
+        <w:rPr>
+          <w:rStyle w:val="Strong"/>
+        </w:rPr>
+        <w:t>Find the Smallest Divisor Given a Threshold</w:t>
+      </w:r>
+      <w:r>
+        <w:t xml:space="preserve"> (LC 1283) — binary search on answer</w:t>
+      </w:r>
+    </w:p>
+    <w:p/>
+    <w:p>
+      <w:pPr>
+        <w:pStyle w:val="ListParagraph"/>
+        <w:numPr>
+          <w:ilvl w:val="0"/>
+          <w:numId w:val="14"/>
+        </w:numPr>
+      </w:pPr>
+      <w:r>
+        <w:t>Search in Rotated Sorted Array (33)</w:t>
+      </w:r>
+      <w:r>
+        <w:tab/>
+      </w:r>
+      <w:proofErr w:type="spellStart"/>
+      <w:r>
+        <w:t>LeetCode</w:t>
+      </w:r>
+      <w:proofErr w:type="spellEnd"/>
+    </w:p>
+    <w:p>
+      <w:pPr>
+        <w:pStyle w:val="ListParagraph"/>
+        <w:numPr>
+          <w:ilvl w:val="0"/>
+          <w:numId w:val="14"/>
+        </w:numPr>
+      </w:pPr>
+      <w:r>
+        <w:t>Search in Rotated Sorted Array II (81)</w:t>
+      </w:r>
+      <w:r>
+        <w:tab/>
+      </w:r>
+      <w:proofErr w:type="spellStart"/>
+      <w:r>
+        <w:t>LeetCode</w:t>
+      </w:r>
+      <w:proofErr w:type="spellEnd"/>
+    </w:p>
+    <w:p>
+      <w:pPr>
+        <w:pStyle w:val="ListParagraph"/>
+        <w:numPr>
+          <w:ilvl w:val="0"/>
+          <w:numId w:val="14"/>
+        </w:numPr>
+      </w:pPr>
+      <w:r>
+        <w:t>Find Minimum in Rotated Sorted Array (153)</w:t>
+      </w:r>
+      <w:r>
+        <w:tab/>
+      </w:r>
+      <w:proofErr w:type="spellStart"/>
+      <w:r>
+        <w:t>LeetCode</w:t>
+      </w:r>
+      <w:proofErr w:type="spellEnd"/>
+    </w:p>
+    <w:p>
+      <w:pPr>
+        <w:pStyle w:val="ListParagraph"/>
+        <w:numPr>
+          <w:ilvl w:val="0"/>
+          <w:numId w:val="14"/>
+        </w:numPr>
+      </w:pPr>
+      <w:r>
+        <w:t>Find Minimum in Rotated Sorted Array II (154)</w:t>
+      </w:r>
+      <w:r>
+        <w:tab/>
+      </w:r>
+      <w:proofErr w:type="spellStart"/>
+      <w:r>
+        <w:t>LeetCode</w:t>
+      </w:r>
+      <w:proofErr w:type="spellEnd"/>
+    </w:p>
+    <w:p>
+      <w:pPr>
+        <w:pStyle w:val="ListParagraph"/>
+      </w:pPr>
+    </w:p>
+    <w:p>
+      <w:pPr>
+        <w:pStyle w:val="ListParagraph"/>
+        <w:numPr>
+          <w:ilvl w:val="0"/>
+          <w:numId w:val="14"/>
+        </w:numPr>
+      </w:pPr>
+      <w:r>
+        <w:t>Search a 2D Matrix (74)</w:t>
+      </w:r>
+      <w:r>
+        <w:tab/>
+      </w:r>
+      <w:proofErr w:type="spellStart"/>
+      <w:r>
+        <w:t>LeetCode</w:t>
+      </w:r>
+      <w:proofErr w:type="spellEnd"/>
+    </w:p>
+    <w:p>
+      <w:pPr>
+        <w:pStyle w:val="ListParagraph"/>
+        <w:numPr>
+          <w:ilvl w:val="0"/>
+          <w:numId w:val="14"/>
+        </w:numPr>
+      </w:pPr>
+      <w:r>
+        <w:t>Search a 2D Matrix II (240)</w:t>
+      </w:r>
+      <w:r>
+        <w:tab/>
+      </w:r>
+      <w:proofErr w:type="spellStart"/>
+      <w:r>
+        <w:t>LeetCode</w:t>
+      </w:r>
+      <w:proofErr w:type="spellEnd"/>
+    </w:p>
+    <w:p>
+      <w:pPr>
+        <w:pStyle w:val="ListParagraph"/>
+        <w:numPr>
+          <w:ilvl w:val="0"/>
+          <w:numId w:val="14"/>
+        </w:numPr>
+      </w:pPr>
+      <w:r>
+        <w:t>Kth Smallest Element in a Sorted Matrix (378)</w:t>
+      </w:r>
+      <w:r>
+        <w:tab/>
+      </w:r>
+      <w:proofErr w:type="spellStart"/>
+      <w:r>
+        <w:t>LeetCode</w:t>
+      </w:r>
+      <w:proofErr w:type="spellEnd"/>
+    </w:p>
+    <w:p/>
+    <w:p>
+      <w:pPr>
+        <w:pStyle w:val="ListParagraph"/>
+        <w:numPr>
+          <w:ilvl w:val="0"/>
+          <w:numId w:val="14"/>
+        </w:numPr>
+      </w:pPr>
+      <w:r>
+        <w:t>Find Peak Element (162)</w:t>
+      </w:r>
+      <w:r>
+        <w:tab/>
+      </w:r>
+      <w:proofErr w:type="spellStart"/>
+      <w:r>
+        <w:t>LeetCode</w:t>
+      </w:r>
+      <w:proofErr w:type="spellEnd"/>
+    </w:p>
+    <w:p>
+      <w:pPr>
+        <w:pStyle w:val="ListParagraph"/>
+        <w:numPr>
+          <w:ilvl w:val="0"/>
+          <w:numId w:val="14"/>
+        </w:numPr>
+      </w:pPr>
+      <w:r>
+        <w:t>Peak Index in a Mountain Array (852)</w:t>
+      </w:r>
+      <w:r>
+        <w:tab/>
+      </w:r>
+      <w:proofErr w:type="spellStart"/>
+      <w:r>
+        <w:t>LeetCode</w:t>
+      </w:r>
+      <w:proofErr w:type="spellEnd"/>
+    </w:p>
+    <w:p>
+      <w:pPr>
+        <w:pStyle w:val="ListParagraph"/>
+        <w:numPr>
+          <w:ilvl w:val="0"/>
+          <w:numId w:val="14"/>
+        </w:numPr>
+      </w:pPr>
+      <w:r>
+        <w:lastRenderedPageBreak/>
+        <w:t>Find in Mountain Array (1095)</w:t>
+      </w:r>
+      <w:r>
+        <w:tab/>
+      </w:r>
+      <w:proofErr w:type="spellStart"/>
+      <w:r>
+        <w:t>LeetCode</w:t>
+      </w:r>
+      <w:proofErr w:type="spellEnd"/>
+    </w:p>
+    <w:p/>
+    <w:p>
+      <w:pPr>
+        <w:pStyle w:val="ListParagraph"/>
+        <w:numPr>
+          <w:ilvl w:val="0"/>
+          <w:numId w:val="14"/>
+        </w:numPr>
+      </w:pPr>
+      <w:r>
+        <w:t>Koko Eating Bananas (875)</w:t>
+      </w:r>
+      <w:r>
+        <w:tab/>
+      </w:r>
+      <w:proofErr w:type="spellStart"/>
+      <w:r>
+        <w:t>LeetCode</w:t>
+      </w:r>
+      <w:proofErr w:type="spellEnd"/>
+    </w:p>
+    <w:p>
+      <w:pPr>
+        <w:pStyle w:val="ListParagraph"/>
+        <w:numPr>
+          <w:ilvl w:val="0"/>
+          <w:numId w:val="14"/>
+        </w:numPr>
+      </w:pPr>
+      <w:r>
+        <w:t>Capacity To Ship Packages Within D Days (1011)</w:t>
+      </w:r>
+      <w:r>
+        <w:tab/>
+      </w:r>
+      <w:proofErr w:type="spellStart"/>
+      <w:r>
+        <w:t>LeetCode</w:t>
+      </w:r>
+      <w:proofErr w:type="spellEnd"/>
+    </w:p>
+    <w:p>
+      <w:pPr>
+        <w:pStyle w:val="ListParagraph"/>
+        <w:numPr>
+          <w:ilvl w:val="0"/>
+          <w:numId w:val="14"/>
+        </w:numPr>
+      </w:pPr>
+      <w:r>
+        <w:t>Magnetic Force Between Two Balls (1552)</w:t>
+      </w:r>
+      <w:r>
+        <w:tab/>
+      </w:r>
+      <w:proofErr w:type="spellStart"/>
+      <w:r>
+        <w:t>LeetCode</w:t>
+      </w:r>
+      <w:proofErr w:type="spellEnd"/>
+    </w:p>
+    <w:p>
+      <w:pPr>
+        <w:pStyle w:val="ListParagraph"/>
+      </w:pPr>
+    </w:p>
+    <w:p>
+      <w:pPr>
+        <w:pStyle w:val="ListParagraph"/>
+        <w:numPr>
+          <w:ilvl w:val="0"/>
+          <w:numId w:val="14"/>
+        </w:numPr>
+      </w:pPr>
+      <w:r>
+        <w:t>Single Element in a Sorted Array (540)</w:t>
+      </w:r>
+      <w:r>
+        <w:tab/>
+      </w:r>
+      <w:proofErr w:type="spellStart"/>
+      <w:r>
+        <w:t>LeetCode</w:t>
+      </w:r>
+      <w:proofErr w:type="spellEnd"/>
+    </w:p>
+    <w:p>
+      <w:pPr>
+        <w:pStyle w:val="ListParagraph"/>
+        <w:numPr>
+          <w:ilvl w:val="0"/>
+          <w:numId w:val="14"/>
+        </w:numPr>
+      </w:pPr>
+      <w:r>
+        <w:t>Missing Element in Sorted Array</w:t>
+      </w:r>
+      <w:r>
+        <w:tab/>
+      </w:r>
+      <w:proofErr w:type="spellStart"/>
+      <w:r>
+        <w:t>LeetCode</w:t>
+      </w:r>
+      <w:proofErr w:type="spellEnd"/>
+      <w:r>
+        <w:t xml:space="preserve"> Premium</w:t>
+      </w:r>
+    </w:p>
+    <w:p>
+      <w:pPr>
+        <w:pStyle w:val="ListParagraph"/>
+        <w:numPr>
+          <w:ilvl w:val="0"/>
+          <w:numId w:val="14"/>
+        </w:numPr>
+      </w:pPr>
+      <w:r>
+        <w:t>Find K Closest Elements (658)</w:t>
+      </w:r>
+      <w:r>
+        <w:tab/>
+      </w:r>
+      <w:proofErr w:type="spellStart"/>
+      <w:r>
+        <w:t>LeetCode</w:t>
+      </w:r>
+      <w:proofErr w:type="spellEnd"/>
+    </w:p>
+    <w:p/>
+    <w:p>
+      <w:pPr>
+        <w:pStyle w:val="ListParagraph"/>
+        <w:numPr>
+          <w:ilvl w:val="0"/>
+          <w:numId w:val="14"/>
+        </w:numPr>
+      </w:pPr>
+      <w:r>
+        <w:t xml:space="preserve">Search in </w:t>
+      </w:r>
+      <w:proofErr w:type="spellStart"/>
+      <w:r>
+        <w:t>Bitonic</w:t>
+      </w:r>
+      <w:proofErr w:type="spellEnd"/>
+      <w:r>
+        <w:t xml:space="preserve"> Array</w:t>
+      </w:r>
+      <w:r>
+        <w:tab/>
+      </w:r>
+      <w:proofErr w:type="spellStart"/>
+      <w:r>
+        <w:t>GeeksforGeeks</w:t>
+      </w:r>
+      <w:proofErr w:type="spellEnd"/>
+    </w:p>
+    <w:p>
+      <w:pPr>
+        <w:pStyle w:val="ListParagraph"/>
+        <w:numPr>
+          <w:ilvl w:val="0"/>
+          <w:numId w:val="14"/>
+        </w:numPr>
+      </w:pPr>
+      <w:r>
+        <w:t>Number of Times Sorted Array is Rotated</w:t>
+      </w:r>
+      <w:r>
+        <w:tab/>
+      </w:r>
+      <w:proofErr w:type="spellStart"/>
+      <w:r>
+        <w:t>GeeksforGeeks</w:t>
+      </w:r>
+      <w:proofErr w:type="spellEnd"/>
+    </w:p>
+    <w:p>
+      <w:pPr>
+        <w:pStyle w:val="ListParagraph"/>
+        <w:numPr>
+          <w:ilvl w:val="0"/>
+          <w:numId w:val="14"/>
+        </w:numPr>
+      </w:pPr>
+      <w:r>
+        <w:t>Allocate Minimum Number of Pages</w:t>
+      </w:r>
+      <w:r>
+        <w:tab/>
+      </w:r>
+      <w:proofErr w:type="spellStart"/>
+      <w:r>
+        <w:t>GeeksforGeeks</w:t>
+      </w:r>
+      <w:proofErr w:type="spellEnd"/>
+    </w:p>
+    <w:p/>
+    <w:p/>
+    <w:p/>
+    <w:p/>
+    <w:p/>
+    <w:p/>
+    <w:p/>
+    <w:p/>
+    <w:p/>
+    <w:p/>
+    <w:p>
+      <w:pPr>
+        <w:rPr>
+          <w:b/>
+          <w:sz w:val="28"/>
+        </w:rPr>
+      </w:pPr>
+      <w:r>
+        <w:rPr>
+          <w:b/>
+          <w:sz w:val="28"/>
+        </w:rPr>
+        <w:t>Level 3 — Advanced / FAANG bar-raiser tier</w:t>
+      </w:r>
+    </w:p>
+    <w:p>
+      <w:pPr>
+        <w:rPr>
+          <w:b/>
+          <w:sz w:val="8"/>
+        </w:rPr>
+      </w:pPr>
+    </w:p>
+    <w:p>
+      <w:pPr>
+        <w:numPr>
+          <w:ilvl w:val="0"/>
+          <w:numId w:val="12"/>
+        </w:numPr>
+        <w:spacing w:before="100" w:beforeAutospacing="1" w:after="100" w:afterAutospacing="1" w:line="240" w:lineRule="auto"/>
+      </w:pPr>
+      <w:r>
+        <w:rPr>
+          <w:rStyle w:val="Strong"/>
+        </w:rPr>
+        <w:t>Minimize Max Distance to Gas Station</w:t>
+      </w:r>
+      <w:r>
+        <w:t xml:space="preserve"> (LC 774) — binary search on a real-valued answer space</w:t>
+      </w:r>
+    </w:p>
+    <w:p>
+      <w:pPr>
+        <w:numPr>
+          <w:ilvl w:val="0"/>
+          <w:numId w:val="12"/>
+        </w:numPr>
+        <w:spacing w:before="100" w:beforeAutospacing="1" w:after="100" w:afterAutospacing="1" w:line="240" w:lineRule="auto"/>
+      </w:pPr>
+      <w:r>
+        <w:rPr>
+          <w:rStyle w:val="Strong"/>
+        </w:rPr>
+        <w:t>Median of a Row-Wise Sorted Matrix</w:t>
+      </w:r>
+      <w:r>
+        <w:t xml:space="preserve"> — </w:t>
+      </w:r>
+      <w:proofErr w:type="spellStart"/>
+      <w:r>
+        <w:t>GfG</w:t>
+      </w:r>
+      <w:proofErr w:type="spellEnd"/>
+      <w:r>
+        <w:t xml:space="preserve"> (no clean single LC equivalent), extends the matrix + binary search idea</w:t>
+      </w:r>
+    </w:p>
+    <w:p>
+      <w:pPr>
+        <w:numPr>
+          <w:ilvl w:val="0"/>
+          <w:numId w:val="12"/>
+        </w:numPr>
+        <w:spacing w:before="100" w:beforeAutospacing="1" w:after="100" w:afterAutospacing="1" w:line="240" w:lineRule="auto"/>
+      </w:pPr>
+      <w:r>
+        <w:rPr>
+          <w:rStyle w:val="Strong"/>
+        </w:rPr>
+        <w:t>Nth Magical Number</w:t>
+      </w:r>
+      <w:r>
+        <w:t xml:space="preserve"> (LC 878) — binary search + math/LCM feasibility</w:t>
+      </w:r>
+    </w:p>
+    <w:p>
+      <w:pPr>
+        <w:numPr>
+          <w:ilvl w:val="0"/>
+          <w:numId w:val="12"/>
+        </w:numPr>
+        <w:spacing w:before="100" w:beforeAutospacing="1" w:after="100" w:afterAutospacing="1" w:line="240" w:lineRule="auto"/>
+      </w:pPr>
+      <w:r>
+        <w:rPr>
+          <w:rStyle w:val="Strong"/>
+        </w:rPr>
+        <w:t>Woodcutter's Problem / Cutting Wood (Koko-style variant)</w:t>
+      </w:r>
+      <w:r>
+        <w:t xml:space="preserve"> — </w:t>
+      </w:r>
+      <w:proofErr w:type="spellStart"/>
+      <w:r>
+        <w:t>GfG</w:t>
+      </w:r>
+      <w:proofErr w:type="spellEnd"/>
+      <w:r>
+        <w:t xml:space="preserve"> (reinforces the same pattern from a different framing)</w:t>
+      </w:r>
+    </w:p>
+    <w:p/>
+    <w:p>
+      <w:pPr>
+        <w:pStyle w:val="ListParagraph"/>
+        <w:numPr>
+          <w:ilvl w:val="0"/>
+          <w:numId w:val="15"/>
+        </w:numPr>
+      </w:pPr>
+      <w:r>
+        <w:t>Split Array Largest Sum (410)</w:t>
+      </w:r>
+      <w:r>
+        <w:tab/>
+      </w:r>
+      <w:proofErr w:type="spellStart"/>
+      <w:r>
+        <w:t>LeetCode</w:t>
+      </w:r>
+      <w:proofErr w:type="spellEnd"/>
+    </w:p>
+    <w:p>
+      <w:pPr>
+        <w:pStyle w:val="ListParagraph"/>
+        <w:numPr>
+          <w:ilvl w:val="0"/>
+          <w:numId w:val="15"/>
+        </w:numPr>
+      </w:pPr>
+      <w:r>
+        <w:t>Minimum Number of Days to Make m Bouquets (1482)</w:t>
+      </w:r>
+      <w:r>
+        <w:tab/>
+      </w:r>
+      <w:proofErr w:type="spellStart"/>
+      <w:r>
+        <w:t>LeetCode</w:t>
+      </w:r>
+      <w:proofErr w:type="spellEnd"/>
+    </w:p>
+    <w:p>
+      <w:pPr>
+        <w:pStyle w:val="ListParagraph"/>
+        <w:numPr>
+          <w:ilvl w:val="0"/>
+          <w:numId w:val="15"/>
+        </w:numPr>
+      </w:pPr>
+      <w:r>
+        <w:t>Divide Chocolate (1231)</w:t>
+      </w:r>
+      <w:r>
+        <w:tab/>
+      </w:r>
+      <w:proofErr w:type="spellStart"/>
+      <w:r>
+        <w:t>LeetCode</w:t>
+      </w:r>
+      <w:proofErr w:type="spellEnd"/>
+    </w:p>
+    <w:p>
+      <w:pPr>
+        <w:pStyle w:val="ListParagraph"/>
+        <w:numPr>
+          <w:ilvl w:val="0"/>
+          <w:numId w:val="15"/>
+        </w:numPr>
+      </w:pPr>
+      <w:r>
+        <w:t>Minimized Maximum of Products Distributed to Any Store (2064)</w:t>
+      </w:r>
+      <w:r>
+        <w:tab/>
+      </w:r>
+      <w:proofErr w:type="spellStart"/>
+      <w:r>
+        <w:t>LeetCode</w:t>
+      </w:r>
+      <w:proofErr w:type="spellEnd"/>
+    </w:p>
+    <w:p>
+      <w:pPr>
+        <w:pStyle w:val="ListParagraph"/>
+        <w:numPr>
+          <w:ilvl w:val="0"/>
+          <w:numId w:val="15"/>
+        </w:numPr>
+      </w:pPr>
+      <w:r>
+        <w:t>Maximum Value at a Given Index (1802)</w:t>
+      </w:r>
+      <w:r>
+        <w:tab/>
+      </w:r>
+      <w:proofErr w:type="spellStart"/>
+      <w:r>
+        <w:t>LeetCode</w:t>
+      </w:r>
+      <w:proofErr w:type="spellEnd"/>
+    </w:p>
+    <w:p/>
+    <w:p>
+      <w:pPr>
+        <w:pStyle w:val="ListParagraph"/>
+        <w:numPr>
+          <w:ilvl w:val="0"/>
+          <w:numId w:val="15"/>
+        </w:numPr>
+      </w:pPr>
+      <w:r>
+        <w:lastRenderedPageBreak/>
+        <w:t>Median of Two Sorted Arrays (4)</w:t>
+      </w:r>
+      <w:r>
+        <w:tab/>
+      </w:r>
+      <w:proofErr w:type="spellStart"/>
+      <w:r>
+        <w:t>LeetCode</w:t>
+      </w:r>
+      <w:proofErr w:type="spellEnd"/>
+    </w:p>
+    <w:p>
+      <w:pPr>
+        <w:pStyle w:val="ListParagraph"/>
+        <w:numPr>
+          <w:ilvl w:val="0"/>
+          <w:numId w:val="15"/>
+        </w:numPr>
+      </w:pPr>
+      <w:r>
+        <w:t>Kth Smallest Pair Distance (719)</w:t>
+      </w:r>
+      <w:r>
+        <w:tab/>
+      </w:r>
+      <w:proofErr w:type="spellStart"/>
+      <w:r>
+        <w:t>LeetCode</w:t>
+      </w:r>
+      <w:proofErr w:type="spellEnd"/>
+    </w:p>
+    <w:p>
+      <w:pPr>
+        <w:pStyle w:val="ListParagraph"/>
+        <w:numPr>
+          <w:ilvl w:val="0"/>
+          <w:numId w:val="15"/>
+        </w:numPr>
+      </w:pPr>
+      <w:r>
+        <w:t>Find K-</w:t>
+      </w:r>
+      <w:proofErr w:type="spellStart"/>
+      <w:r>
+        <w:t>th</w:t>
+      </w:r>
+      <w:proofErr w:type="spellEnd"/>
+      <w:r>
+        <w:t xml:space="preserve"> Smallest Pair Distance (719)</w:t>
+      </w:r>
+      <w:r>
+        <w:tab/>
+      </w:r>
+      <w:proofErr w:type="spellStart"/>
+      <w:r>
+        <w:t>LeetCode</w:t>
+      </w:r>
+      <w:proofErr w:type="spellEnd"/>
+    </w:p>
+    <w:p>
+      <w:pPr>
+        <w:pStyle w:val="ListParagraph"/>
+        <w:numPr>
+          <w:ilvl w:val="0"/>
+          <w:numId w:val="15"/>
+        </w:numPr>
+      </w:pPr>
+      <w:r>
+        <w:t>H-Index II (275)</w:t>
+      </w:r>
+      <w:r>
+        <w:tab/>
+      </w:r>
+      <w:proofErr w:type="spellStart"/>
+      <w:r>
+        <w:t>LeetCode</w:t>
+      </w:r>
+      <w:proofErr w:type="spellEnd"/>
+    </w:p>
+    <w:p/>
+    <w:p>
+      <w:pPr>
+        <w:pStyle w:val="ListParagraph"/>
+        <w:numPr>
+          <w:ilvl w:val="0"/>
+          <w:numId w:val="15"/>
+        </w:numPr>
+      </w:pPr>
+      <w:r>
+        <w:t>Swim in Rising Water (778)</w:t>
+      </w:r>
+      <w:r>
+        <w:tab/>
+      </w:r>
+      <w:proofErr w:type="spellStart"/>
+      <w:r>
+        <w:t>LeetCode</w:t>
+      </w:r>
+      <w:proofErr w:type="spellEnd"/>
+    </w:p>
+    <w:p>
+      <w:pPr>
+        <w:pStyle w:val="ListParagraph"/>
+        <w:numPr>
+          <w:ilvl w:val="0"/>
+          <w:numId w:val="15"/>
+        </w:numPr>
+      </w:pPr>
+      <w:r>
+        <w:t>Path With Minimum Effort (1631)</w:t>
+      </w:r>
+      <w:r>
+        <w:tab/>
+      </w:r>
+      <w:proofErr w:type="spellStart"/>
+      <w:r>
+        <w:t>LeetCode</w:t>
+      </w:r>
+      <w:proofErr w:type="spellEnd"/>
+    </w:p>
+    <w:p>
+      <w:pPr>
+        <w:pStyle w:val="ListParagraph"/>
+        <w:numPr>
+          <w:ilvl w:val="0"/>
+          <w:numId w:val="15"/>
+        </w:numPr>
+      </w:pPr>
+      <w:r>
+        <w:t>Maximum Candies Allocated to K Children (2226)</w:t>
+      </w:r>
+      <w:r>
+        <w:tab/>
+      </w:r>
+      <w:proofErr w:type="spellStart"/>
+      <w:r>
+        <w:t>LeetCode</w:t>
+      </w:r>
+      <w:proofErr w:type="spellEnd"/>
+    </w:p>
+    <w:p/>
+    <w:p>
+      <w:pPr>
+        <w:pStyle w:val="ListParagraph"/>
+        <w:numPr>
+          <w:ilvl w:val="0"/>
+          <w:numId w:val="15"/>
+        </w:numPr>
+      </w:pPr>
+      <w:r>
+        <w:t>Kth Smallest Element in a Sorted Matrix (378)</w:t>
+      </w:r>
+      <w:r>
+        <w:tab/>
+      </w:r>
+      <w:proofErr w:type="spellStart"/>
+      <w:r>
+        <w:t>LeetCode</w:t>
+      </w:r>
+      <w:proofErr w:type="spellEnd"/>
+    </w:p>
+    <w:p>
+      <w:pPr>
+        <w:pStyle w:val="ListParagraph"/>
+        <w:numPr>
+          <w:ilvl w:val="0"/>
+          <w:numId w:val="15"/>
+        </w:numPr>
+      </w:pPr>
+      <w:r>
+        <w:t>Search a 2D Matrix II (240)</w:t>
+      </w:r>
+      <w:r>
+        <w:tab/>
+      </w:r>
+      <w:proofErr w:type="spellStart"/>
+      <w:r>
+        <w:t>LeetCode</w:t>
+      </w:r>
+      <w:proofErr w:type="spellEnd"/>
+    </w:p>
+    <w:p/>
+    <w:p>
+      <w:pPr>
+        <w:pStyle w:val="ListParagraph"/>
+        <w:numPr>
+          <w:ilvl w:val="0"/>
+          <w:numId w:val="15"/>
+        </w:numPr>
+      </w:pPr>
+      <w:r>
+        <w:t>Aggressive Cows</w:t>
+      </w:r>
+      <w:r>
+        <w:tab/>
+      </w:r>
+      <w:proofErr w:type="spellStart"/>
+      <w:r>
+        <w:t>GeeksforGeeks</w:t>
+      </w:r>
+      <w:proofErr w:type="spellEnd"/>
+    </w:p>
+    <w:p>
+      <w:pPr>
+        <w:pStyle w:val="ListParagraph"/>
+        <w:numPr>
+          <w:ilvl w:val="0"/>
+          <w:numId w:val="15"/>
+        </w:numPr>
+      </w:pPr>
+      <w:r>
+        <w:t>Painter's Partition Problem</w:t>
+      </w:r>
+      <w:r>
+        <w:tab/>
+      </w:r>
+      <w:proofErr w:type="spellStart"/>
+      <w:r>
+        <w:t>GeeksforGeeks</w:t>
+      </w:r>
+      <w:proofErr w:type="spellEnd"/>
+    </w:p>
+    <w:p>
+      <w:pPr>
+        <w:pStyle w:val="ListParagraph"/>
+        <w:numPr>
+          <w:ilvl w:val="0"/>
+          <w:numId w:val="15"/>
+        </w:numPr>
+      </w:pPr>
+      <w:r>
+        <w:t>Book Allocation Problem</w:t>
+      </w:r>
+      <w:r>
+        <w:tab/>
+      </w:r>
+      <w:proofErr w:type="spellStart"/>
+      <w:r>
+        <w:t>GeeksforGeeks</w:t>
+      </w:r>
+      <w:proofErr w:type="spellEnd"/>
+    </w:p>
+    <w:p/>
+    <w:p>
+      <w:pPr>
+        <w:pStyle w:val="ListParagraph"/>
+        <w:numPr>
+          <w:ilvl w:val="0"/>
+          <w:numId w:val="15"/>
+        </w:numPr>
+      </w:pPr>
+      <w:r>
+        <w:t>Median of Two Sorted Arrays (4)</w:t>
+      </w:r>
+      <w:r>
+        <w:tab/>
+      </w:r>
+      <w:proofErr w:type="spellStart"/>
+      <w:r>
+        <w:t>LeetCode</w:t>
+      </w:r>
+      <w:proofErr w:type="spellEnd"/>
+      <w:r>
+        <w:t xml:space="preserve"> (Imp)</w:t>
+      </w:r>
+    </w:p>
+    <w:p>
+      <w:pPr>
+        <w:pStyle w:val="ListParagraph"/>
+        <w:numPr>
+          <w:ilvl w:val="0"/>
+          <w:numId w:val="15"/>
+        </w:numPr>
+      </w:pPr>
+      <w:r>
+        <w:t>Find in Mountain Array (1095)</w:t>
+      </w:r>
+      <w:r>
+        <w:tab/>
+      </w:r>
+      <w:proofErr w:type="spellStart"/>
+      <w:r>
+        <w:t>LeetCode</w:t>
+      </w:r>
+      <w:proofErr w:type="spellEnd"/>
+    </w:p>
+    <w:p>
+      <w:pPr>
+        <w:pStyle w:val="ListParagraph"/>
+        <w:numPr>
+          <w:ilvl w:val="0"/>
+          <w:numId w:val="15"/>
+        </w:numPr>
+      </w:pPr>
+      <w:r>
+        <w:t>Divide Chocolate (1231)</w:t>
+      </w:r>
+      <w:r>
+        <w:tab/>
+      </w:r>
+      <w:proofErr w:type="spellStart"/>
+      <w:r>
+        <w:t>LeetCode</w:t>
+      </w:r>
+      <w:proofErr w:type="spellEnd"/>
+    </w:p>
+    <w:p>
+      <w:pPr>
+        <w:pStyle w:val="ListParagraph"/>
+        <w:numPr>
+          <w:ilvl w:val="0"/>
+          <w:numId w:val="15"/>
+        </w:numPr>
         <w:rPr>
           <w:rFonts w:asciiTheme="majorHAnsi" w:eastAsiaTheme="majorEastAsia" w:hAnsiTheme="majorHAnsi"/>
           <w:color w:val="2F5496" w:themeColor="accent1" w:themeShade="BF"/>
@@ -2716,6 +4142,20 @@
         </w:rPr>
       </w:pPr>
       <w:r>
+        <w:t>Split Array Largest Sum (410)</w:t>
+      </w:r>
+      <w:r>
+        <w:tab/>
+      </w:r>
+      <w:proofErr w:type="spellStart"/>
+      <w:r>
+        <w:t>LeetCode</w:t>
+      </w:r>
+      <w:proofErr w:type="spellEnd"/>
+      <w:r>
+        <w:t xml:space="preserve"> </w:t>
+      </w:r>
+      <w:r>
         <w:br w:type="page"/>
       </w:r>
     </w:p>
@@ -2730,7 +4170,7 @@
           <w:sz w:val="48"/>
         </w:rPr>
       </w:pPr>
-      <w:bookmarkStart w:id="15" w:name="_Toc207697058"/>
+      <w:bookmarkStart w:id="16" w:name="_Toc207697058"/>
       <w:r>
         <w:rPr>
           <w:rFonts w:cstheme="majorHAnsi"/>
@@ -2740,7 +4180,7 @@
         <w:lastRenderedPageBreak/>
         <w:t>SOLUTIONS:</w:t>
       </w:r>
-      <w:bookmarkEnd w:id="15"/>
+      <w:bookmarkEnd w:id="16"/>
     </w:p>
     <w:p>
       <w:pPr>
@@ -2750,7 +4190,7 @@
           <w:sz w:val="36"/>
         </w:rPr>
       </w:pPr>
-      <w:bookmarkStart w:id="16" w:name="_Toc207697059"/>
+      <w:bookmarkStart w:id="17" w:name="_Toc207697059"/>
       <w:r>
         <w:rPr>
           <w:b/>
@@ -2765,7 +4205,7 @@
         </w:rPr>
         <w:t>:</w:t>
       </w:r>
-      <w:bookmarkEnd w:id="16"/>
+      <w:bookmarkEnd w:id="17"/>
     </w:p>
     <w:p>
       <w:pPr>
@@ -15276,6 +16716,36 @@
         </w:rPr>
         <w:t>right):</w:t>
       </w:r>
+      <w:r>
+        <w:rPr>
+          <w:rFonts w:ascii="Consolas" w:eastAsia="Times New Roman" w:hAnsi="Consolas" w:cs="Times New Roman"/>
+          <w:color w:val="CCCCCC"/>
+          <w:sz w:val="21"/>
+          <w:szCs w:val="21"/>
+          <w:lang w:eastAsia="en-IN"/>
+        </w:rPr>
+        <w:t xml:space="preserve">      </w:t>
+      </w:r>
+      <w:r>
+        <w:rPr>
+          <w:rFonts w:ascii="Consolas" w:eastAsia="Times New Roman" w:hAnsi="Consolas" w:cs="Times New Roman"/>
+          <w:color w:val="6A9955"/>
+          <w:sz w:val="21"/>
+          <w:szCs w:val="21"/>
+          <w:lang w:eastAsia="en-IN"/>
+        </w:rPr>
+        <w:t xml:space="preserve">#remember </w:t>
+      </w:r>
+      <w:r>
+        <w:rPr>
+          <w:rFonts w:ascii="Consolas" w:eastAsia="Times New Roman" w:hAnsi="Consolas" w:cs="Times New Roman"/>
+          <w:color w:val="6A9955"/>
+          <w:sz w:val="21"/>
+          <w:szCs w:val="21"/>
+          <w:lang w:eastAsia="en-IN"/>
+        </w:rPr>
+        <w:t xml:space="preserve">now not l&lt;=r, it is l&lt;r. As r not decreasing </w:t>
+      </w:r>
     </w:p>
     <w:p>
       <w:pPr>
@@ -19107,9 +20577,8 @@
           <w:szCs w:val="21"/>
           <w:lang w:eastAsia="en-IN"/>
         </w:rPr>
-        <w:t xml:space="preserve"># </w:t>
-      </w:r>
-      <w:proofErr w:type="gramStart"/>
+        <w:t># if sq</w:t>
+      </w:r>
       <w:r>
         <w:rPr>
           <w:rFonts w:ascii="Consolas" w:eastAsia="Times New Roman" w:hAnsi="Consolas" w:cs="Times New Roman"/>
@@ -19118,9 +20587,8 @@
           <w:szCs w:val="21"/>
           <w:lang w:eastAsia="en-IN"/>
         </w:rPr>
-        <w:t>if</w:t>
-      </w:r>
-      <w:proofErr w:type="gramEnd"/>
+        <w:t>u</w:t>
+      </w:r>
       <w:r>
         <w:rPr>
           <w:rFonts w:ascii="Consolas" w:eastAsia="Times New Roman" w:hAnsi="Consolas" w:cs="Times New Roman"/>
@@ -19129,29 +20597,7 @@
           <w:szCs w:val="21"/>
           <w:lang w:eastAsia="en-IN"/>
         </w:rPr>
-        <w:t xml:space="preserve"> </w:t>
-      </w:r>
-      <w:proofErr w:type="spellStart"/>
-      <w:r>
-        <w:rPr>
-          <w:rFonts w:ascii="Consolas" w:eastAsia="Times New Roman" w:hAnsi="Consolas" w:cs="Times New Roman"/>
-          <w:color w:val="6A9955"/>
-          <w:sz w:val="21"/>
-          <w:szCs w:val="21"/>
-          <w:lang w:eastAsia="en-IN"/>
-        </w:rPr>
-        <w:t>sqare</w:t>
-      </w:r>
-      <w:proofErr w:type="spellEnd"/>
-      <w:r>
-        <w:rPr>
-          <w:rFonts w:ascii="Consolas" w:eastAsia="Times New Roman" w:hAnsi="Consolas" w:cs="Times New Roman"/>
-          <w:color w:val="6A9955"/>
-          <w:sz w:val="21"/>
-          <w:szCs w:val="21"/>
-          <w:lang w:eastAsia="en-IN"/>
-        </w:rPr>
-        <w:t xml:space="preserve"> of mid is less than x, it can be ans. But we need to find that largest mid</w:t>
+        <w:t>are of mid is less than x, it can be ans. But we need to find that largest mid</w:t>
       </w:r>
     </w:p>
     <w:p>
@@ -19817,7 +21263,7 @@
           <w:sz w:val="36"/>
         </w:rPr>
       </w:pPr>
-      <w:bookmarkStart w:id="17" w:name="_Toc207697060"/>
+      <w:bookmarkStart w:id="18" w:name="_Toc207697060"/>
       <w:r>
         <w:rPr>
           <w:b/>
@@ -19840,7 +21286,7 @@
         </w:rPr>
         <w:t>:</w:t>
       </w:r>
-      <w:bookmarkEnd w:id="17"/>
+      <w:bookmarkEnd w:id="18"/>
       <w:r>
         <w:rPr>
           <w:b/>
@@ -23170,6 +24616,26 @@
           <w:lang w:eastAsia="en-IN"/>
         </w:rPr>
         <w:t xml:space="preserve"> right:</w:t>
+      </w:r>
+      <w:r>
+        <w:rPr>
+          <w:rFonts w:ascii="Consolas" w:eastAsia="Times New Roman" w:hAnsi="Consolas" w:cs="Times New Roman"/>
+          <w:color w:val="CCCCCC"/>
+          <w:sz w:val="21"/>
+          <w:szCs w:val="21"/>
+          <w:lang w:eastAsia="en-IN"/>
+        </w:rPr>
+        <w:t xml:space="preserve">  </w:t>
+      </w:r>
+      <w:r>
+        <w:rPr>
+          <w:rFonts w:ascii="Consolas" w:eastAsia="Times New Roman" w:hAnsi="Consolas" w:cs="Times New Roman"/>
+          <w:color w:val="6A9955"/>
+          <w:sz w:val="21"/>
+          <w:szCs w:val="21"/>
+          <w:lang w:eastAsia="en-IN"/>
+        </w:rPr>
+        <w:t># When r not changing to mid+1, that time l&lt;r, else l&lt;=r</w:t>
       </w:r>
     </w:p>
     <w:p>
@@ -31954,8 +33420,6 @@
           <w:sz w:val="6"/>
         </w:rPr>
       </w:pPr>
-      <w:bookmarkStart w:id="18" w:name="_GoBack"/>
-      <w:bookmarkEnd w:id="18"/>
     </w:p>
     <w:p>
       <w:pPr>
@@ -32098,7 +33562,7 @@
         <w:noProof/>
         <w:color w:val="404040" w:themeColor="text1" w:themeTint="BF"/>
       </w:rPr>
-      <w:t>17</w:t>
+      <w:t>2</w:t>
     </w:r>
     <w:r>
       <w:rPr>
@@ -32474,6 +33938,232 @@
     </w:lvl>
   </w:abstractNum>
   <w:abstractNum w:abstractNumId="3" w15:restartNumberingAfterBreak="0">
+    <w:nsid w:val="286611A8"/>
+    <w:multiLevelType w:val="hybridMultilevel"/>
+    <w:tmpl w:val="BE125F44"/>
+    <w:lvl w:ilvl="0" w:tplc="40090001">
+      <w:start w:val="1"/>
+      <w:numFmt w:val="bullet"/>
+      <w:lvlText w:val=""/>
+      <w:lvlJc w:val="left"/>
+      <w:pPr>
+        <w:ind w:left="720" w:hanging="360"/>
+      </w:pPr>
+      <w:rPr>
+        <w:rFonts w:ascii="Symbol" w:hAnsi="Symbol" w:hint="default"/>
+      </w:rPr>
+    </w:lvl>
+    <w:lvl w:ilvl="1" w:tplc="40090003" w:tentative="1">
+      <w:start w:val="1"/>
+      <w:numFmt w:val="bullet"/>
+      <w:lvlText w:val="o"/>
+      <w:lvlJc w:val="left"/>
+      <w:pPr>
+        <w:ind w:left="1440" w:hanging="360"/>
+      </w:pPr>
+      <w:rPr>
+        <w:rFonts w:ascii="Courier New" w:hAnsi="Courier New" w:cs="Courier New" w:hint="default"/>
+      </w:rPr>
+    </w:lvl>
+    <w:lvl w:ilvl="2" w:tplc="40090005" w:tentative="1">
+      <w:start w:val="1"/>
+      <w:numFmt w:val="bullet"/>
+      <w:lvlText w:val=""/>
+      <w:lvlJc w:val="left"/>
+      <w:pPr>
+        <w:ind w:left="2160" w:hanging="360"/>
+      </w:pPr>
+      <w:rPr>
+        <w:rFonts w:ascii="Wingdings" w:hAnsi="Wingdings" w:hint="default"/>
+      </w:rPr>
+    </w:lvl>
+    <w:lvl w:ilvl="3" w:tplc="40090001" w:tentative="1">
+      <w:start w:val="1"/>
+      <w:numFmt w:val="bullet"/>
+      <w:lvlText w:val=""/>
+      <w:lvlJc w:val="left"/>
+      <w:pPr>
+        <w:ind w:left="2880" w:hanging="360"/>
+      </w:pPr>
+      <w:rPr>
+        <w:rFonts w:ascii="Symbol" w:hAnsi="Symbol" w:hint="default"/>
+      </w:rPr>
+    </w:lvl>
+    <w:lvl w:ilvl="4" w:tplc="40090003" w:tentative="1">
+      <w:start w:val="1"/>
+      <w:numFmt w:val="bullet"/>
+      <w:lvlText w:val="o"/>
+      <w:lvlJc w:val="left"/>
+      <w:pPr>
+        <w:ind w:left="3600" w:hanging="360"/>
+      </w:pPr>
+      <w:rPr>
+        <w:rFonts w:ascii="Courier New" w:hAnsi="Courier New" w:cs="Courier New" w:hint="default"/>
+      </w:rPr>
+    </w:lvl>
+    <w:lvl w:ilvl="5" w:tplc="40090005" w:tentative="1">
+      <w:start w:val="1"/>
+      <w:numFmt w:val="bullet"/>
+      <w:lvlText w:val=""/>
+      <w:lvlJc w:val="left"/>
+      <w:pPr>
+        <w:ind w:left="4320" w:hanging="360"/>
+      </w:pPr>
+      <w:rPr>
+        <w:rFonts w:ascii="Wingdings" w:hAnsi="Wingdings" w:hint="default"/>
+      </w:rPr>
+    </w:lvl>
+    <w:lvl w:ilvl="6" w:tplc="40090001" w:tentative="1">
+      <w:start w:val="1"/>
+      <w:numFmt w:val="bullet"/>
+      <w:lvlText w:val=""/>
+      <w:lvlJc w:val="left"/>
+      <w:pPr>
+        <w:ind w:left="5040" w:hanging="360"/>
+      </w:pPr>
+      <w:rPr>
+        <w:rFonts w:ascii="Symbol" w:hAnsi="Symbol" w:hint="default"/>
+      </w:rPr>
+    </w:lvl>
+    <w:lvl w:ilvl="7" w:tplc="40090003" w:tentative="1">
+      <w:start w:val="1"/>
+      <w:numFmt w:val="bullet"/>
+      <w:lvlText w:val="o"/>
+      <w:lvlJc w:val="left"/>
+      <w:pPr>
+        <w:ind w:left="5760" w:hanging="360"/>
+      </w:pPr>
+      <w:rPr>
+        <w:rFonts w:ascii="Courier New" w:hAnsi="Courier New" w:cs="Courier New" w:hint="default"/>
+      </w:rPr>
+    </w:lvl>
+    <w:lvl w:ilvl="8" w:tplc="40090005" w:tentative="1">
+      <w:start w:val="1"/>
+      <w:numFmt w:val="bullet"/>
+      <w:lvlText w:val=""/>
+      <w:lvlJc w:val="left"/>
+      <w:pPr>
+        <w:ind w:left="6480" w:hanging="360"/>
+      </w:pPr>
+      <w:rPr>
+        <w:rFonts w:ascii="Wingdings" w:hAnsi="Wingdings" w:hint="default"/>
+      </w:rPr>
+    </w:lvl>
+  </w:abstractNum>
+  <w:abstractNum w:abstractNumId="4" w15:restartNumberingAfterBreak="0">
+    <w:nsid w:val="29B128F0"/>
+    <w:multiLevelType w:val="multilevel"/>
+    <w:tmpl w:val="6C021722"/>
+    <w:lvl w:ilvl="0">
+      <w:start w:val="1"/>
+      <w:numFmt w:val="decimal"/>
+      <w:lvlText w:val="%1."/>
+      <w:lvlJc w:val="left"/>
+      <w:pPr>
+        <w:tabs>
+          <w:tab w:val="num" w:pos="720"/>
+        </w:tabs>
+        <w:ind w:left="720" w:hanging="360"/>
+      </w:pPr>
+    </w:lvl>
+    <w:lvl w:ilvl="1" w:tentative="1">
+      <w:start w:val="1"/>
+      <w:numFmt w:val="decimal"/>
+      <w:lvlText w:val="%2."/>
+      <w:lvlJc w:val="left"/>
+      <w:pPr>
+        <w:tabs>
+          <w:tab w:val="num" w:pos="1440"/>
+        </w:tabs>
+        <w:ind w:left="1440" w:hanging="360"/>
+      </w:pPr>
+    </w:lvl>
+    <w:lvl w:ilvl="2" w:tentative="1">
+      <w:start w:val="1"/>
+      <w:numFmt w:val="decimal"/>
+      <w:lvlText w:val="%3."/>
+      <w:lvlJc w:val="left"/>
+      <w:pPr>
+        <w:tabs>
+          <w:tab w:val="num" w:pos="2160"/>
+        </w:tabs>
+        <w:ind w:left="2160" w:hanging="360"/>
+      </w:pPr>
+    </w:lvl>
+    <w:lvl w:ilvl="3" w:tentative="1">
+      <w:start w:val="1"/>
+      <w:numFmt w:val="decimal"/>
+      <w:lvlText w:val="%4."/>
+      <w:lvlJc w:val="left"/>
+      <w:pPr>
+        <w:tabs>
+          <w:tab w:val="num" w:pos="2880"/>
+        </w:tabs>
+        <w:ind w:left="2880" w:hanging="360"/>
+      </w:pPr>
+    </w:lvl>
+    <w:lvl w:ilvl="4" w:tentative="1">
+      <w:start w:val="1"/>
+      <w:numFmt w:val="decimal"/>
+      <w:lvlText w:val="%5."/>
+      <w:lvlJc w:val="left"/>
+      <w:pPr>
+        <w:tabs>
+          <w:tab w:val="num" w:pos="3600"/>
+        </w:tabs>
+        <w:ind w:left="3600" w:hanging="360"/>
+      </w:pPr>
+    </w:lvl>
+    <w:lvl w:ilvl="5" w:tentative="1">
+      <w:start w:val="1"/>
+      <w:numFmt w:val="decimal"/>
+      <w:lvlText w:val="%6."/>
+      <w:lvlJc w:val="left"/>
+      <w:pPr>
+        <w:tabs>
+          <w:tab w:val="num" w:pos="4320"/>
+        </w:tabs>
+        <w:ind w:left="4320" w:hanging="360"/>
+      </w:pPr>
+    </w:lvl>
+    <w:lvl w:ilvl="6" w:tentative="1">
+      <w:start w:val="1"/>
+      <w:numFmt w:val="decimal"/>
+      <w:lvlText w:val="%7."/>
+      <w:lvlJc w:val="left"/>
+      <w:pPr>
+        <w:tabs>
+          <w:tab w:val="num" w:pos="5040"/>
+        </w:tabs>
+        <w:ind w:left="5040" w:hanging="360"/>
+      </w:pPr>
+    </w:lvl>
+    <w:lvl w:ilvl="7" w:tentative="1">
+      <w:start w:val="1"/>
+      <w:numFmt w:val="decimal"/>
+      <w:lvlText w:val="%8."/>
+      <w:lvlJc w:val="left"/>
+      <w:pPr>
+        <w:tabs>
+          <w:tab w:val="num" w:pos="5760"/>
+        </w:tabs>
+        <w:ind w:left="5760" w:hanging="360"/>
+      </w:pPr>
+    </w:lvl>
+    <w:lvl w:ilvl="8" w:tentative="1">
+      <w:start w:val="1"/>
+      <w:numFmt w:val="decimal"/>
+      <w:lvlText w:val="%9."/>
+      <w:lvlJc w:val="left"/>
+      <w:pPr>
+        <w:tabs>
+          <w:tab w:val="num" w:pos="6480"/>
+        </w:tabs>
+        <w:ind w:left="6480" w:hanging="360"/>
+      </w:pPr>
+    </w:lvl>
+  </w:abstractNum>
+  <w:abstractNum w:abstractNumId="5" w15:restartNumberingAfterBreak="0">
     <w:nsid w:val="35D44ADE"/>
     <w:multiLevelType w:val="hybridMultilevel"/>
     <w:tmpl w:val="03C618C6"/>
@@ -32559,7 +34249,120 @@
       </w:pPr>
     </w:lvl>
   </w:abstractNum>
-  <w:abstractNum w:abstractNumId="4" w15:restartNumberingAfterBreak="0">
+  <w:abstractNum w:abstractNumId="6" w15:restartNumberingAfterBreak="0">
+    <w:nsid w:val="3DD8508E"/>
+    <w:multiLevelType w:val="hybridMultilevel"/>
+    <w:tmpl w:val="C44AEE0C"/>
+    <w:lvl w:ilvl="0" w:tplc="40090001">
+      <w:start w:val="1"/>
+      <w:numFmt w:val="bullet"/>
+      <w:lvlText w:val=""/>
+      <w:lvlJc w:val="left"/>
+      <w:pPr>
+        <w:ind w:left="720" w:hanging="360"/>
+      </w:pPr>
+      <w:rPr>
+        <w:rFonts w:ascii="Symbol" w:hAnsi="Symbol" w:hint="default"/>
+      </w:rPr>
+    </w:lvl>
+    <w:lvl w:ilvl="1" w:tplc="40090003" w:tentative="1">
+      <w:start w:val="1"/>
+      <w:numFmt w:val="bullet"/>
+      <w:lvlText w:val="o"/>
+      <w:lvlJc w:val="left"/>
+      <w:pPr>
+        <w:ind w:left="1440" w:hanging="360"/>
+      </w:pPr>
+      <w:rPr>
+        <w:rFonts w:ascii="Courier New" w:hAnsi="Courier New" w:cs="Courier New" w:hint="default"/>
+      </w:rPr>
+    </w:lvl>
+    <w:lvl w:ilvl="2" w:tplc="40090005" w:tentative="1">
+      <w:start w:val="1"/>
+      <w:numFmt w:val="bullet"/>
+      <w:lvlText w:val=""/>
+      <w:lvlJc w:val="left"/>
+      <w:pPr>
+        <w:ind w:left="2160" w:hanging="360"/>
+      </w:pPr>
+      <w:rPr>
+        <w:rFonts w:ascii="Wingdings" w:hAnsi="Wingdings" w:hint="default"/>
+      </w:rPr>
+    </w:lvl>
+    <w:lvl w:ilvl="3" w:tplc="40090001" w:tentative="1">
+      <w:start w:val="1"/>
+      <w:numFmt w:val="bullet"/>
+      <w:lvlText w:val=""/>
+      <w:lvlJc w:val="left"/>
+      <w:pPr>
+        <w:ind w:left="2880" w:hanging="360"/>
+      </w:pPr>
+      <w:rPr>
+        <w:rFonts w:ascii="Symbol" w:hAnsi="Symbol" w:hint="default"/>
+      </w:rPr>
+    </w:lvl>
+    <w:lvl w:ilvl="4" w:tplc="40090003" w:tentative="1">
+      <w:start w:val="1"/>
+      <w:numFmt w:val="bullet"/>
+      <w:lvlText w:val="o"/>
+      <w:lvlJc w:val="left"/>
+      <w:pPr>
+        <w:ind w:left="3600" w:hanging="360"/>
+      </w:pPr>
+      <w:rPr>
+        <w:rFonts w:ascii="Courier New" w:hAnsi="Courier New" w:cs="Courier New" w:hint="default"/>
+      </w:rPr>
+    </w:lvl>
+    <w:lvl w:ilvl="5" w:tplc="40090005" w:tentative="1">
+      <w:start w:val="1"/>
+      <w:numFmt w:val="bullet"/>
+      <w:lvlText w:val=""/>
+      <w:lvlJc w:val="left"/>
+      <w:pPr>
+        <w:ind w:left="4320" w:hanging="360"/>
+      </w:pPr>
+      <w:rPr>
+        <w:rFonts w:ascii="Wingdings" w:hAnsi="Wingdings" w:hint="default"/>
+      </w:rPr>
+    </w:lvl>
+    <w:lvl w:ilvl="6" w:tplc="40090001" w:tentative="1">
+      <w:start w:val="1"/>
+      <w:numFmt w:val="bullet"/>
+      <w:lvlText w:val=""/>
+      <w:lvlJc w:val="left"/>
+      <w:pPr>
+        <w:ind w:left="5040" w:hanging="360"/>
+      </w:pPr>
+      <w:rPr>
+        <w:rFonts w:ascii="Symbol" w:hAnsi="Symbol" w:hint="default"/>
+      </w:rPr>
+    </w:lvl>
+    <w:lvl w:ilvl="7" w:tplc="40090003" w:tentative="1">
+      <w:start w:val="1"/>
+      <w:numFmt w:val="bullet"/>
+      <w:lvlText w:val="o"/>
+      <w:lvlJc w:val="left"/>
+      <w:pPr>
+        <w:ind w:left="5760" w:hanging="360"/>
+      </w:pPr>
+      <w:rPr>
+        <w:rFonts w:ascii="Courier New" w:hAnsi="Courier New" w:cs="Courier New" w:hint="default"/>
+      </w:rPr>
+    </w:lvl>
+    <w:lvl w:ilvl="8" w:tplc="40090005" w:tentative="1">
+      <w:start w:val="1"/>
+      <w:numFmt w:val="bullet"/>
+      <w:lvlText w:val=""/>
+      <w:lvlJc w:val="left"/>
+      <w:pPr>
+        <w:ind w:left="6480" w:hanging="360"/>
+      </w:pPr>
+      <w:rPr>
+        <w:rFonts w:ascii="Wingdings" w:hAnsi="Wingdings" w:hint="default"/>
+      </w:rPr>
+    </w:lvl>
+  </w:abstractNum>
+  <w:abstractNum w:abstractNumId="7" w15:restartNumberingAfterBreak="0">
     <w:nsid w:val="4340404E"/>
     <w:multiLevelType w:val="hybridMultilevel"/>
     <w:tmpl w:val="722EDE08"/>
@@ -32648,7 +34451,120 @@
       </w:pPr>
     </w:lvl>
   </w:abstractNum>
-  <w:abstractNum w:abstractNumId="5" w15:restartNumberingAfterBreak="0">
+  <w:abstractNum w:abstractNumId="8" w15:restartNumberingAfterBreak="0">
+    <w:nsid w:val="4A7A636B"/>
+    <w:multiLevelType w:val="multilevel"/>
+    <w:tmpl w:val="B3740372"/>
+    <w:lvl w:ilvl="0">
+      <w:start w:val="1"/>
+      <w:numFmt w:val="decimal"/>
+      <w:lvlText w:val="%1."/>
+      <w:lvlJc w:val="left"/>
+      <w:pPr>
+        <w:tabs>
+          <w:tab w:val="num" w:pos="720"/>
+        </w:tabs>
+        <w:ind w:left="720" w:hanging="360"/>
+      </w:pPr>
+    </w:lvl>
+    <w:lvl w:ilvl="1" w:tentative="1">
+      <w:start w:val="1"/>
+      <w:numFmt w:val="decimal"/>
+      <w:lvlText w:val="%2."/>
+      <w:lvlJc w:val="left"/>
+      <w:pPr>
+        <w:tabs>
+          <w:tab w:val="num" w:pos="1440"/>
+        </w:tabs>
+        <w:ind w:left="1440" w:hanging="360"/>
+      </w:pPr>
+    </w:lvl>
+    <w:lvl w:ilvl="2" w:tentative="1">
+      <w:start w:val="1"/>
+      <w:numFmt w:val="decimal"/>
+      <w:lvlText w:val="%3."/>
+      <w:lvlJc w:val="left"/>
+      <w:pPr>
+        <w:tabs>
+          <w:tab w:val="num" w:pos="2160"/>
+        </w:tabs>
+        <w:ind w:left="2160" w:hanging="360"/>
+      </w:pPr>
+    </w:lvl>
+    <w:lvl w:ilvl="3" w:tentative="1">
+      <w:start w:val="1"/>
+      <w:numFmt w:val="decimal"/>
+      <w:lvlText w:val="%4."/>
+      <w:lvlJc w:val="left"/>
+      <w:pPr>
+        <w:tabs>
+          <w:tab w:val="num" w:pos="2880"/>
+        </w:tabs>
+        <w:ind w:left="2880" w:hanging="360"/>
+      </w:pPr>
+    </w:lvl>
+    <w:lvl w:ilvl="4" w:tentative="1">
+      <w:start w:val="1"/>
+      <w:numFmt w:val="decimal"/>
+      <w:lvlText w:val="%5."/>
+      <w:lvlJc w:val="left"/>
+      <w:pPr>
+        <w:tabs>
+          <w:tab w:val="num" w:pos="3600"/>
+        </w:tabs>
+        <w:ind w:left="3600" w:hanging="360"/>
+      </w:pPr>
+    </w:lvl>
+    <w:lvl w:ilvl="5" w:tentative="1">
+      <w:start w:val="1"/>
+      <w:numFmt w:val="decimal"/>
+      <w:lvlText w:val="%6."/>
+      <w:lvlJc w:val="left"/>
+      <w:pPr>
+        <w:tabs>
+          <w:tab w:val="num" w:pos="4320"/>
+        </w:tabs>
+        <w:ind w:left="4320" w:hanging="360"/>
+      </w:pPr>
+    </w:lvl>
+    <w:lvl w:ilvl="6" w:tentative="1">
+      <w:start w:val="1"/>
+      <w:numFmt w:val="decimal"/>
+      <w:lvlText w:val="%7."/>
+      <w:lvlJc w:val="left"/>
+      <w:pPr>
+        <w:tabs>
+          <w:tab w:val="num" w:pos="5040"/>
+        </w:tabs>
+        <w:ind w:left="5040" w:hanging="360"/>
+      </w:pPr>
+    </w:lvl>
+    <w:lvl w:ilvl="7" w:tentative="1">
+      <w:start w:val="1"/>
+      <w:numFmt w:val="decimal"/>
+      <w:lvlText w:val="%8."/>
+      <w:lvlJc w:val="left"/>
+      <w:pPr>
+        <w:tabs>
+          <w:tab w:val="num" w:pos="5760"/>
+        </w:tabs>
+        <w:ind w:left="5760" w:hanging="360"/>
+      </w:pPr>
+    </w:lvl>
+    <w:lvl w:ilvl="8" w:tentative="1">
+      <w:start w:val="1"/>
+      <w:numFmt w:val="decimal"/>
+      <w:lvlText w:val="%9."/>
+      <w:lvlJc w:val="left"/>
+      <w:pPr>
+        <w:tabs>
+          <w:tab w:val="num" w:pos="6480"/>
+        </w:tabs>
+        <w:ind w:left="6480" w:hanging="360"/>
+      </w:pPr>
+    </w:lvl>
+  </w:abstractNum>
+  <w:abstractNum w:abstractNumId="9" w15:restartNumberingAfterBreak="0">
     <w:nsid w:val="4AB6745D"/>
     <w:multiLevelType w:val="multilevel"/>
     <w:tmpl w:val="E22E870C"/>
@@ -32797,7 +34713,120 @@
       </w:rPr>
     </w:lvl>
   </w:abstractNum>
-  <w:abstractNum w:abstractNumId="6" w15:restartNumberingAfterBreak="0">
+  <w:abstractNum w:abstractNumId="10" w15:restartNumberingAfterBreak="0">
+    <w:nsid w:val="502C7240"/>
+    <w:multiLevelType w:val="multilevel"/>
+    <w:tmpl w:val="BBE83784"/>
+    <w:lvl w:ilvl="0">
+      <w:start w:val="1"/>
+      <w:numFmt w:val="decimal"/>
+      <w:lvlText w:val="%1."/>
+      <w:lvlJc w:val="left"/>
+      <w:pPr>
+        <w:tabs>
+          <w:tab w:val="num" w:pos="720"/>
+        </w:tabs>
+        <w:ind w:left="720" w:hanging="360"/>
+      </w:pPr>
+    </w:lvl>
+    <w:lvl w:ilvl="1" w:tentative="1">
+      <w:start w:val="1"/>
+      <w:numFmt w:val="decimal"/>
+      <w:lvlText w:val="%2."/>
+      <w:lvlJc w:val="left"/>
+      <w:pPr>
+        <w:tabs>
+          <w:tab w:val="num" w:pos="1440"/>
+        </w:tabs>
+        <w:ind w:left="1440" w:hanging="360"/>
+      </w:pPr>
+    </w:lvl>
+    <w:lvl w:ilvl="2" w:tentative="1">
+      <w:start w:val="1"/>
+      <w:numFmt w:val="decimal"/>
+      <w:lvlText w:val="%3."/>
+      <w:lvlJc w:val="left"/>
+      <w:pPr>
+        <w:tabs>
+          <w:tab w:val="num" w:pos="2160"/>
+        </w:tabs>
+        <w:ind w:left="2160" w:hanging="360"/>
+      </w:pPr>
+    </w:lvl>
+    <w:lvl w:ilvl="3" w:tentative="1">
+      <w:start w:val="1"/>
+      <w:numFmt w:val="decimal"/>
+      <w:lvlText w:val="%4."/>
+      <w:lvlJc w:val="left"/>
+      <w:pPr>
+        <w:tabs>
+          <w:tab w:val="num" w:pos="2880"/>
+        </w:tabs>
+        <w:ind w:left="2880" w:hanging="360"/>
+      </w:pPr>
+    </w:lvl>
+    <w:lvl w:ilvl="4" w:tentative="1">
+      <w:start w:val="1"/>
+      <w:numFmt w:val="decimal"/>
+      <w:lvlText w:val="%5."/>
+      <w:lvlJc w:val="left"/>
+      <w:pPr>
+        <w:tabs>
+          <w:tab w:val="num" w:pos="3600"/>
+        </w:tabs>
+        <w:ind w:left="3600" w:hanging="360"/>
+      </w:pPr>
+    </w:lvl>
+    <w:lvl w:ilvl="5" w:tentative="1">
+      <w:start w:val="1"/>
+      <w:numFmt w:val="decimal"/>
+      <w:lvlText w:val="%6."/>
+      <w:lvlJc w:val="left"/>
+      <w:pPr>
+        <w:tabs>
+          <w:tab w:val="num" w:pos="4320"/>
+        </w:tabs>
+        <w:ind w:left="4320" w:hanging="360"/>
+      </w:pPr>
+    </w:lvl>
+    <w:lvl w:ilvl="6" w:tentative="1">
+      <w:start w:val="1"/>
+      <w:numFmt w:val="decimal"/>
+      <w:lvlText w:val="%7."/>
+      <w:lvlJc w:val="left"/>
+      <w:pPr>
+        <w:tabs>
+          <w:tab w:val="num" w:pos="5040"/>
+        </w:tabs>
+        <w:ind w:left="5040" w:hanging="360"/>
+      </w:pPr>
+    </w:lvl>
+    <w:lvl w:ilvl="7" w:tentative="1">
+      <w:start w:val="1"/>
+      <w:numFmt w:val="decimal"/>
+      <w:lvlText w:val="%8."/>
+      <w:lvlJc w:val="left"/>
+      <w:pPr>
+        <w:tabs>
+          <w:tab w:val="num" w:pos="5760"/>
+        </w:tabs>
+        <w:ind w:left="5760" w:hanging="360"/>
+      </w:pPr>
+    </w:lvl>
+    <w:lvl w:ilvl="8" w:tentative="1">
+      <w:start w:val="1"/>
+      <w:numFmt w:val="decimal"/>
+      <w:lvlText w:val="%9."/>
+      <w:lvlJc w:val="left"/>
+      <w:pPr>
+        <w:tabs>
+          <w:tab w:val="num" w:pos="6480"/>
+        </w:tabs>
+        <w:ind w:left="6480" w:hanging="360"/>
+      </w:pPr>
+    </w:lvl>
+  </w:abstractNum>
+  <w:abstractNum w:abstractNumId="11" w15:restartNumberingAfterBreak="0">
     <w:nsid w:val="552D67DA"/>
     <w:multiLevelType w:val="hybridMultilevel"/>
     <w:tmpl w:val="922C49FE"/>
@@ -32886,7 +34915,7 @@
       </w:pPr>
     </w:lvl>
   </w:abstractNum>
-  <w:abstractNum w:abstractNumId="7" w15:restartNumberingAfterBreak="0">
+  <w:abstractNum w:abstractNumId="12" w15:restartNumberingAfterBreak="0">
     <w:nsid w:val="5E1E696F"/>
     <w:multiLevelType w:val="multilevel"/>
     <w:tmpl w:val="1472B5DA"/>
@@ -32999,7 +35028,7 @@
       </w:pPr>
     </w:lvl>
   </w:abstractNum>
-  <w:abstractNum w:abstractNumId="8" w15:restartNumberingAfterBreak="0">
+  <w:abstractNum w:abstractNumId="13" w15:restartNumberingAfterBreak="0">
     <w:nsid w:val="620C2229"/>
     <w:multiLevelType w:val="hybridMultilevel"/>
     <w:tmpl w:val="6DB8A0A2"/>
@@ -33112,32 +35141,163 @@
       </w:rPr>
     </w:lvl>
   </w:abstractNum>
+  <w:abstractNum w:abstractNumId="14" w15:restartNumberingAfterBreak="0">
+    <w:nsid w:val="7A957864"/>
+    <w:multiLevelType w:val="hybridMultilevel"/>
+    <w:tmpl w:val="6B3EA13E"/>
+    <w:lvl w:ilvl="0" w:tplc="40090001">
+      <w:start w:val="1"/>
+      <w:numFmt w:val="bullet"/>
+      <w:lvlText w:val=""/>
+      <w:lvlJc w:val="left"/>
+      <w:pPr>
+        <w:ind w:left="720" w:hanging="360"/>
+      </w:pPr>
+      <w:rPr>
+        <w:rFonts w:ascii="Symbol" w:hAnsi="Symbol" w:hint="default"/>
+      </w:rPr>
+    </w:lvl>
+    <w:lvl w:ilvl="1" w:tplc="40090003" w:tentative="1">
+      <w:start w:val="1"/>
+      <w:numFmt w:val="bullet"/>
+      <w:lvlText w:val="o"/>
+      <w:lvlJc w:val="left"/>
+      <w:pPr>
+        <w:ind w:left="1440" w:hanging="360"/>
+      </w:pPr>
+      <w:rPr>
+        <w:rFonts w:ascii="Courier New" w:hAnsi="Courier New" w:cs="Courier New" w:hint="default"/>
+      </w:rPr>
+    </w:lvl>
+    <w:lvl w:ilvl="2" w:tplc="40090005" w:tentative="1">
+      <w:start w:val="1"/>
+      <w:numFmt w:val="bullet"/>
+      <w:lvlText w:val=""/>
+      <w:lvlJc w:val="left"/>
+      <w:pPr>
+        <w:ind w:left="2160" w:hanging="360"/>
+      </w:pPr>
+      <w:rPr>
+        <w:rFonts w:ascii="Wingdings" w:hAnsi="Wingdings" w:hint="default"/>
+      </w:rPr>
+    </w:lvl>
+    <w:lvl w:ilvl="3" w:tplc="40090001" w:tentative="1">
+      <w:start w:val="1"/>
+      <w:numFmt w:val="bullet"/>
+      <w:lvlText w:val=""/>
+      <w:lvlJc w:val="left"/>
+      <w:pPr>
+        <w:ind w:left="2880" w:hanging="360"/>
+      </w:pPr>
+      <w:rPr>
+        <w:rFonts w:ascii="Symbol" w:hAnsi="Symbol" w:hint="default"/>
+      </w:rPr>
+    </w:lvl>
+    <w:lvl w:ilvl="4" w:tplc="40090003" w:tentative="1">
+      <w:start w:val="1"/>
+      <w:numFmt w:val="bullet"/>
+      <w:lvlText w:val="o"/>
+      <w:lvlJc w:val="left"/>
+      <w:pPr>
+        <w:ind w:left="3600" w:hanging="360"/>
+      </w:pPr>
+      <w:rPr>
+        <w:rFonts w:ascii="Courier New" w:hAnsi="Courier New" w:cs="Courier New" w:hint="default"/>
+      </w:rPr>
+    </w:lvl>
+    <w:lvl w:ilvl="5" w:tplc="40090005" w:tentative="1">
+      <w:start w:val="1"/>
+      <w:numFmt w:val="bullet"/>
+      <w:lvlText w:val=""/>
+      <w:lvlJc w:val="left"/>
+      <w:pPr>
+        <w:ind w:left="4320" w:hanging="360"/>
+      </w:pPr>
+      <w:rPr>
+        <w:rFonts w:ascii="Wingdings" w:hAnsi="Wingdings" w:hint="default"/>
+      </w:rPr>
+    </w:lvl>
+    <w:lvl w:ilvl="6" w:tplc="40090001" w:tentative="1">
+      <w:start w:val="1"/>
+      <w:numFmt w:val="bullet"/>
+      <w:lvlText w:val=""/>
+      <w:lvlJc w:val="left"/>
+      <w:pPr>
+        <w:ind w:left="5040" w:hanging="360"/>
+      </w:pPr>
+      <w:rPr>
+        <w:rFonts w:ascii="Symbol" w:hAnsi="Symbol" w:hint="default"/>
+      </w:rPr>
+    </w:lvl>
+    <w:lvl w:ilvl="7" w:tplc="40090003" w:tentative="1">
+      <w:start w:val="1"/>
+      <w:numFmt w:val="bullet"/>
+      <w:lvlText w:val="o"/>
+      <w:lvlJc w:val="left"/>
+      <w:pPr>
+        <w:ind w:left="5760" w:hanging="360"/>
+      </w:pPr>
+      <w:rPr>
+        <w:rFonts w:ascii="Courier New" w:hAnsi="Courier New" w:cs="Courier New" w:hint="default"/>
+      </w:rPr>
+    </w:lvl>
+    <w:lvl w:ilvl="8" w:tplc="40090005" w:tentative="1">
+      <w:start w:val="1"/>
+      <w:numFmt w:val="bullet"/>
+      <w:lvlText w:val=""/>
+      <w:lvlJc w:val="left"/>
+      <w:pPr>
+        <w:ind w:left="6480" w:hanging="360"/>
+      </w:pPr>
+      <w:rPr>
+        <w:rFonts w:ascii="Wingdings" w:hAnsi="Wingdings" w:hint="default"/>
+      </w:rPr>
+    </w:lvl>
+  </w:abstractNum>
   <w:num w:numId="1">
     <w:abstractNumId w:val="0"/>
   </w:num>
   <w:num w:numId="2">
+    <w:abstractNumId w:val="9"/>
+  </w:num>
+  <w:num w:numId="3">
+    <w:abstractNumId w:val="12"/>
+  </w:num>
+  <w:num w:numId="4">
+    <w:abstractNumId w:val="7"/>
+  </w:num>
+  <w:num w:numId="5">
+    <w:abstractNumId w:val="11"/>
+  </w:num>
+  <w:num w:numId="6">
     <w:abstractNumId w:val="5"/>
   </w:num>
-  <w:num w:numId="3">
-    <w:abstractNumId w:val="7"/>
-  </w:num>
-  <w:num w:numId="4">
-    <w:abstractNumId w:val="4"/>
-  </w:num>
-  <w:num w:numId="5">
-    <w:abstractNumId w:val="6"/>
-  </w:num>
-  <w:num w:numId="6">
-    <w:abstractNumId w:val="3"/>
-  </w:num>
   <w:num w:numId="7">
-    <w:abstractNumId w:val="8"/>
+    <w:abstractNumId w:val="13"/>
   </w:num>
   <w:num w:numId="8">
     <w:abstractNumId w:val="2"/>
   </w:num>
   <w:num w:numId="9">
     <w:abstractNumId w:val="1"/>
+  </w:num>
+  <w:num w:numId="10">
+    <w:abstractNumId w:val="8"/>
+  </w:num>
+  <w:num w:numId="11">
+    <w:abstractNumId w:val="10"/>
+  </w:num>
+  <w:num w:numId="12">
+    <w:abstractNumId w:val="4"/>
+  </w:num>
+  <w:num w:numId="13">
+    <w:abstractNumId w:val="3"/>
+  </w:num>
+  <w:num w:numId="14">
+    <w:abstractNumId w:val="14"/>
+  </w:num>
+  <w:num w:numId="15">
+    <w:abstractNumId w:val="6"/>
   </w:num>
   <w:numIdMacAtCleanup w:val="6"/>
 </w:numbering>
@@ -33646,6 +35806,7 @@
   <w:style w:type="character" w:default="1" w:styleId="DefaultParagraphFont">
     <w:name w:val="Default Paragraph Font"/>
     <w:uiPriority w:val="1"/>
+    <w:semiHidden/>
     <w:unhideWhenUsed/>
   </w:style>
   <w:style w:type="table" w:default="1" w:styleId="TableNormal">
@@ -34124,6 +36285,20 @@
       <w:szCs w:val="24"/>
     </w:rPr>
   </w:style>
+  <w:style w:type="paragraph" w:customStyle="1" w:styleId="font-claude-response-body">
+    <w:name w:val="font-claude-response-body"/>
+    <w:basedOn w:val="Normal"/>
+    <w:rsid w:val="00EA6040"/>
+    <w:pPr>
+      <w:spacing w:before="100" w:beforeAutospacing="1" w:after="100" w:afterAutospacing="1" w:line="240" w:lineRule="auto"/>
+    </w:pPr>
+    <w:rPr>
+      <w:rFonts w:ascii="Times New Roman" w:eastAsia="Times New Roman" w:hAnsi="Times New Roman" w:cs="Times New Roman"/>
+      <w:sz w:val="24"/>
+      <w:szCs w:val="24"/>
+      <w:lang w:eastAsia="en-IN"/>
+    </w:rPr>
+  </w:style>
 </w:styles>
 </file>
 
@@ -34427,7 +36602,7 @@
 </file>
 
 <file path=customXml/itemProps1.xml><?xml version="1.0" encoding="utf-8"?>
-<ds:datastoreItem xmlns:ds="http://schemas.openxmlformats.org/officeDocument/2006/customXml" ds:itemID="{B4732043-69E2-46A8-A87E-D0B3B30375CD}">
+<ds:datastoreItem xmlns:ds="http://schemas.openxmlformats.org/officeDocument/2006/customXml" ds:itemID="{C07C1803-BAA7-46A7-B58E-D713D88560D0}">
   <ds:schemaRefs>
     <ds:schemaRef ds:uri="http://schemas.openxmlformats.org/officeDocument/2006/bibliography"/>
   </ds:schemaRefs>

</xml_diff>

<commit_message>
Binary Search: Started medium level problems
</commit_message>
<xml_diff>
--- a/08. Binary Search/Binary Search.docx
+++ b/08. Binary Search/Binary Search.docx
@@ -1766,29 +1766,7 @@
             <w:szCs w:val="24"/>
             <w:u w:val="none"/>
           </w:rPr>
-          <w:t>https://www.geeksforgeeks.org/problems/i</w:t>
-        </w:r>
-        <w:r>
-          <w:rPr>
-            <w:rStyle w:val="Hyperlink"/>
-            <w:rFonts w:asciiTheme="majorHAnsi" w:hAnsiTheme="majorHAnsi" w:cstheme="majorHAnsi"/>
-            <w:color w:val="1F4E79" w:themeColor="accent5" w:themeShade="80"/>
-            <w:sz w:val="24"/>
-            <w:szCs w:val="24"/>
-            <w:u w:val="none"/>
-          </w:rPr>
-          <w:t>m</w:t>
-        </w:r>
-        <w:r>
-          <w:rPr>
-            <w:rStyle w:val="Hyperlink"/>
-            <w:rFonts w:asciiTheme="majorHAnsi" w:hAnsiTheme="majorHAnsi" w:cstheme="majorHAnsi"/>
-            <w:color w:val="1F4E79" w:themeColor="accent5" w:themeShade="80"/>
-            <w:sz w:val="24"/>
-            <w:szCs w:val="24"/>
-            <w:u w:val="none"/>
-          </w:rPr>
-          <w:t>plement-lower-bound/1</w:t>
+          <w:t>https://www.geeksforgeeks.org/problems/implement-lower-bound/1</w:t>
         </w:r>
       </w:hyperlink>
     </w:p>
@@ -1822,29 +1800,7 @@
             <w:szCs w:val="24"/>
             <w:u w:val="none"/>
           </w:rPr>
-          <w:t xml:space="preserve"> https://www.geek</w:t>
-        </w:r>
-        <w:r>
-          <w:rPr>
-            <w:rStyle w:val="Hyperlink"/>
-            <w:rFonts w:asciiTheme="majorHAnsi" w:hAnsiTheme="majorHAnsi" w:cstheme="majorHAnsi"/>
-            <w:color w:val="1F4E79" w:themeColor="accent5" w:themeShade="80"/>
-            <w:sz w:val="24"/>
-            <w:szCs w:val="24"/>
-            <w:u w:val="none"/>
-          </w:rPr>
-          <w:t>s</w:t>
-        </w:r>
-        <w:r>
-          <w:rPr>
-            <w:rStyle w:val="Hyperlink"/>
-            <w:rFonts w:asciiTheme="majorHAnsi" w:hAnsiTheme="majorHAnsi" w:cstheme="majorHAnsi"/>
-            <w:color w:val="1F4E79" w:themeColor="accent5" w:themeShade="80"/>
-            <w:sz w:val="24"/>
-            <w:szCs w:val="24"/>
-            <w:u w:val="none"/>
-          </w:rPr>
-          <w:t>forgeeks.org/problems/implement-upper-bound/1</w:t>
+          <w:t xml:space="preserve"> https://www.geeksforgeeks.org/problems/implement-upper-bound/1</w:t>
         </w:r>
       </w:hyperlink>
     </w:p>
@@ -1990,29 +1946,7 @@
             <w:szCs w:val="24"/>
             <w:u w:val="none"/>
           </w:rPr>
-          <w:t>https://www.geeksforgeeks.org/problems/num</w:t>
-        </w:r>
-        <w:r>
-          <w:rPr>
-            <w:rStyle w:val="Hyperlink"/>
-            <w:rFonts w:asciiTheme="majorHAnsi" w:hAnsiTheme="majorHAnsi" w:cstheme="majorHAnsi"/>
-            <w:color w:val="1F4E79" w:themeColor="accent5" w:themeShade="80"/>
-            <w:sz w:val="24"/>
-            <w:szCs w:val="24"/>
-            <w:u w:val="none"/>
-          </w:rPr>
-          <w:t>b</w:t>
-        </w:r>
-        <w:r>
-          <w:rPr>
-            <w:rStyle w:val="Hyperlink"/>
-            <w:rFonts w:asciiTheme="majorHAnsi" w:hAnsiTheme="majorHAnsi" w:cstheme="majorHAnsi"/>
-            <w:color w:val="1F4E79" w:themeColor="accent5" w:themeShade="80"/>
-            <w:sz w:val="24"/>
-            <w:szCs w:val="24"/>
-            <w:u w:val="none"/>
-          </w:rPr>
-          <w:t>er-of-occurrence2259/1</w:t>
+          <w:t>https://www.geeksforgeeks.org/problems/number-of-occurrence2259/1</w:t>
         </w:r>
       </w:hyperlink>
     </w:p>
@@ -2082,29 +2016,7 @@
             <w:szCs w:val="24"/>
             <w:u w:val="none"/>
           </w:rPr>
-          <w:t>https://www.geeksfo</w:t>
-        </w:r>
-        <w:r>
-          <w:rPr>
-            <w:rStyle w:val="Hyperlink"/>
-            <w:rFonts w:asciiTheme="majorHAnsi" w:hAnsiTheme="majorHAnsi" w:cstheme="majorHAnsi"/>
-            <w:color w:val="1F4E79" w:themeColor="accent5" w:themeShade="80"/>
-            <w:sz w:val="24"/>
-            <w:szCs w:val="24"/>
-            <w:u w:val="none"/>
-          </w:rPr>
-          <w:t>r</w:t>
-        </w:r>
-        <w:r>
-          <w:rPr>
-            <w:rStyle w:val="Hyperlink"/>
-            <w:rFonts w:asciiTheme="majorHAnsi" w:hAnsiTheme="majorHAnsi" w:cstheme="majorHAnsi"/>
-            <w:color w:val="1F4E79" w:themeColor="accent5" w:themeShade="80"/>
-            <w:sz w:val="24"/>
-            <w:szCs w:val="24"/>
-            <w:u w:val="none"/>
-          </w:rPr>
-          <w:t>geeks.org/problems/rotation4723/1</w:t>
+          <w:t>https://www.geeksforgeeks.org/problems/rotation4723/1</w:t>
         </w:r>
       </w:hyperlink>
     </w:p>
@@ -2176,29 +2088,7 @@
             <w:szCs w:val="24"/>
             <w:u w:val="none"/>
           </w:rPr>
-          <w:t>https://leetcode.com/pr</w:t>
-        </w:r>
-        <w:r>
-          <w:rPr>
-            <w:rStyle w:val="Hyperlink"/>
-            <w:rFonts w:asciiTheme="majorHAnsi" w:hAnsiTheme="majorHAnsi" w:cstheme="majorHAnsi"/>
-            <w:color w:val="1F4E79" w:themeColor="accent5" w:themeShade="80"/>
-            <w:sz w:val="24"/>
-            <w:szCs w:val="24"/>
-            <w:u w:val="none"/>
-          </w:rPr>
-          <w:t>o</w:t>
-        </w:r>
-        <w:r>
-          <w:rPr>
-            <w:rStyle w:val="Hyperlink"/>
-            <w:rFonts w:asciiTheme="majorHAnsi" w:hAnsiTheme="majorHAnsi" w:cstheme="majorHAnsi"/>
-            <w:color w:val="1F4E79" w:themeColor="accent5" w:themeShade="80"/>
-            <w:sz w:val="24"/>
-            <w:szCs w:val="24"/>
-            <w:u w:val="none"/>
-          </w:rPr>
-          <w:t>blems/search-in-rotated-sorted-array/</w:t>
+          <w:t>https://leetcode.com/problems/search-in-rotated-sorted-array/</w:t>
         </w:r>
       </w:hyperlink>
     </w:p>
@@ -2250,10 +2140,12 @@
         <w:spacing w:after="0"/>
         <w:ind w:left="720"/>
         <w:rPr>
+          <w:rStyle w:val="Hyperlink"/>
           <w:rFonts w:asciiTheme="majorHAnsi" w:hAnsiTheme="majorHAnsi" w:cstheme="majorHAnsi"/>
           <w:color w:val="1F4E79" w:themeColor="accent5" w:themeShade="80"/>
           <w:sz w:val="24"/>
           <w:szCs w:val="24"/>
+          <w:u w:val="none"/>
         </w:rPr>
       </w:pPr>
       <w:r>
@@ -2284,85 +2176,6 @@
         <w:spacing w:after="0"/>
         <w:ind w:left="720"/>
         <w:rPr>
-          <w:rFonts w:asciiTheme="majorHAnsi" w:hAnsiTheme="majorHAnsi" w:cstheme="majorHAnsi"/>
-          <w:color w:val="1F4E79" w:themeColor="accent5" w:themeShade="80"/>
-          <w:sz w:val="24"/>
-          <w:szCs w:val="24"/>
-        </w:rPr>
-      </w:pPr>
-    </w:p>
-    <w:p>
-      <w:pPr>
-        <w:spacing w:before="100" w:beforeAutospacing="1" w:after="100" w:afterAutospacing="1" w:line="240" w:lineRule="auto"/>
-      </w:pPr>
-    </w:p>
-    <w:p>
-      <w:pPr>
-        <w:ind w:firstLine="720"/>
-      </w:pPr>
-    </w:p>
-    <w:p/>
-    <w:p>
-      <w:pPr>
-        <w:pStyle w:val="Header"/>
-        <w:tabs>
-          <w:tab w:val="clear" w:pos="4513"/>
-          <w:tab w:val="clear" w:pos="9026"/>
-        </w:tabs>
-        <w:spacing w:after="160" w:line="259" w:lineRule="auto"/>
-        <w:rPr>
-          <w:rFonts w:asciiTheme="majorHAnsi" w:eastAsiaTheme="majorEastAsia" w:hAnsiTheme="majorHAnsi"/>
-          <w:color w:val="2F5496" w:themeColor="accent1" w:themeShade="BF"/>
-          <w:szCs w:val="32"/>
-        </w:rPr>
-      </w:pPr>
-      <w:r>
-        <w:br w:type="page"/>
-      </w:r>
-    </w:p>
-    <w:p>
-      <w:pPr>
-        <w:pStyle w:val="Heading1"/>
-        <w:spacing w:line="276" w:lineRule="auto"/>
-        <w:rPr>
-          <w:rFonts w:cstheme="majorHAnsi"/>
-          <w:b/>
-          <w:sz w:val="40"/>
-        </w:rPr>
-      </w:pPr>
-      <w:bookmarkStart w:id="8" w:name="_Toc207697052"/>
-      <w:r>
-        <w:rPr>
-          <w:rFonts w:cstheme="majorHAnsi"/>
-          <w:sz w:val="40"/>
-        </w:rPr>
-        <w:lastRenderedPageBreak/>
-        <w:t>LEVEL 2:</w:t>
-      </w:r>
-      <w:r>
-        <w:rPr>
-          <w:rFonts w:cstheme="majorHAnsi"/>
-          <w:b/>
-          <w:sz w:val="40"/>
-        </w:rPr>
-        <w:t xml:space="preserve"> </w:t>
-      </w:r>
-      <w:r>
-        <w:rPr>
-          <w:rFonts w:cstheme="majorHAnsi"/>
-          <w:b/>
-          <w:color w:val="C45911" w:themeColor="accent2" w:themeShade="BF"/>
-          <w:sz w:val="40"/>
-          <w:u w:val="single"/>
-        </w:rPr>
-        <w:t>Pro</w:t>
-      </w:r>
-      <w:bookmarkEnd w:id="8"/>
-    </w:p>
-    <w:p>
-      <w:pPr>
-        <w:spacing w:after="0"/>
-        <w:rPr>
           <w:rStyle w:val="Hyperlink"/>
           <w:rFonts w:asciiTheme="majorHAnsi" w:hAnsiTheme="majorHAnsi" w:cstheme="majorHAnsi"/>
           <w:color w:val="1F4E79" w:themeColor="accent5" w:themeShade="80"/>
@@ -2377,28 +2190,19 @@
         <w:pStyle w:val="Heading3"/>
         <w:numPr>
           <w:ilvl w:val="0"/>
-          <w:numId w:val="5"/>
+          <w:numId w:val="1"/>
         </w:numPr>
         <w:rPr>
           <w:rFonts w:cstheme="majorHAnsi"/>
           <w:color w:val="1F4E79" w:themeColor="accent5" w:themeShade="80"/>
         </w:rPr>
       </w:pPr>
-      <w:bookmarkStart w:id="9" w:name="_Toc207697053"/>
       <w:r>
         <w:rPr>
           <w:rFonts w:cstheme="majorHAnsi"/>
           <w:color w:val="1F4E79" w:themeColor="accent5" w:themeShade="80"/>
         </w:rPr>
         <w:t>Find Peak Element</w:t>
-      </w:r>
-      <w:bookmarkEnd w:id="9"/>
-      <w:r>
-        <w:rPr>
-          <w:rFonts w:cstheme="majorHAnsi"/>
-          <w:color w:val="1F4E79" w:themeColor="accent5" w:themeShade="80"/>
-        </w:rPr>
-        <w:t xml:space="preserve"> </w:t>
       </w:r>
     </w:p>
     <w:p>
@@ -2439,8 +2243,75 @@
     </w:p>
     <w:p>
       <w:pPr>
+        <w:spacing w:before="100" w:beforeAutospacing="1" w:after="100" w:afterAutospacing="1" w:line="240" w:lineRule="auto"/>
+      </w:pPr>
+    </w:p>
+    <w:p>
+      <w:pPr>
+        <w:ind w:firstLine="720"/>
+      </w:pPr>
+    </w:p>
+    <w:p/>
+    <w:p>
+      <w:pPr>
+        <w:pStyle w:val="Header"/>
+        <w:tabs>
+          <w:tab w:val="clear" w:pos="4513"/>
+          <w:tab w:val="clear" w:pos="9026"/>
+        </w:tabs>
+        <w:spacing w:after="160" w:line="259" w:lineRule="auto"/>
+        <w:rPr>
+          <w:rFonts w:asciiTheme="majorHAnsi" w:eastAsiaTheme="majorEastAsia" w:hAnsiTheme="majorHAnsi"/>
+          <w:color w:val="2F5496" w:themeColor="accent1" w:themeShade="BF"/>
+          <w:szCs w:val="32"/>
+        </w:rPr>
+      </w:pPr>
+      <w:r>
+        <w:br w:type="page"/>
+      </w:r>
+    </w:p>
+    <w:p>
+      <w:pPr>
+        <w:pStyle w:val="Heading1"/>
+        <w:spacing w:line="276" w:lineRule="auto"/>
+        <w:rPr>
+          <w:rFonts w:cstheme="majorHAnsi"/>
+          <w:b/>
+          <w:sz w:val="40"/>
+        </w:rPr>
+      </w:pPr>
+      <w:bookmarkStart w:id="8" w:name="_Toc207697052"/>
+      <w:r>
+        <w:rPr>
+          <w:rFonts w:cstheme="majorHAnsi"/>
+          <w:sz w:val="40"/>
+        </w:rPr>
+        <w:lastRenderedPageBreak/>
+        <w:t>LEVEL 2:</w:t>
+      </w:r>
+      <w:r>
+        <w:rPr>
+          <w:rFonts w:cstheme="majorHAnsi"/>
+          <w:b/>
+          <w:sz w:val="40"/>
+        </w:rPr>
+        <w:t xml:space="preserve"> </w:t>
+      </w:r>
+      <w:r>
+        <w:rPr>
+          <w:rFonts w:cstheme="majorHAnsi"/>
+          <w:b/>
+          <w:color w:val="C45911" w:themeColor="accent2" w:themeShade="BF"/>
+          <w:sz w:val="40"/>
+          <w:u w:val="single"/>
+        </w:rPr>
+        <w:t>Pro</w:t>
+      </w:r>
+      <w:bookmarkEnd w:id="8"/>
+    </w:p>
+    <w:p>
+      <w:pPr>
         <w:spacing w:after="0"/>
-        <w:ind w:left="720"/>
         <w:rPr>
           <w:rFonts w:asciiTheme="majorHAnsi" w:hAnsiTheme="majorHAnsi" w:cstheme="majorHAnsi"/>
           <w:color w:val="1F4E79" w:themeColor="accent5" w:themeShade="80"/>
@@ -2461,7 +2332,7 @@
           <w:color w:val="1F4E79" w:themeColor="accent5" w:themeShade="80"/>
         </w:rPr>
       </w:pPr>
-      <w:bookmarkStart w:id="10" w:name="_Toc207697054"/>
+      <w:bookmarkStart w:id="9" w:name="_Toc207697054"/>
       <w:r>
         <w:rPr>
           <w:rFonts w:cstheme="majorHAnsi"/>
@@ -2469,7 +2340,7 @@
         </w:rPr>
         <w:t>Search in 2D matrix</w:t>
       </w:r>
-      <w:bookmarkEnd w:id="10"/>
+      <w:bookmarkEnd w:id="9"/>
     </w:p>
     <w:p>
       <w:pPr>
@@ -2531,7 +2402,7 @@
           <w:color w:val="1F4E79" w:themeColor="accent5" w:themeShade="80"/>
         </w:rPr>
       </w:pPr>
-      <w:bookmarkStart w:id="11" w:name="_Toc207697055"/>
+      <w:bookmarkStart w:id="10" w:name="_Toc207697055"/>
       <w:r>
         <w:rPr>
           <w:rFonts w:cstheme="majorHAnsi"/>
@@ -2539,7 +2410,7 @@
         </w:rPr>
         <w:t>Allocate Minimum number of pages</w:t>
       </w:r>
-      <w:bookmarkEnd w:id="11"/>
+      <w:bookmarkEnd w:id="10"/>
     </w:p>
     <w:p>
       <w:pPr>
@@ -2599,7 +2470,7 @@
           <w:color w:val="1F4E79" w:themeColor="accent5" w:themeShade="80"/>
         </w:rPr>
       </w:pPr>
-      <w:bookmarkStart w:id="12" w:name="_Toc207697056"/>
+      <w:bookmarkStart w:id="11" w:name="_Toc207697056"/>
       <w:r>
         <w:rPr>
           <w:rFonts w:cstheme="majorHAnsi"/>
@@ -2607,7 +2478,7 @@
         </w:rPr>
         <w:t>Koko Eating Bananas</w:t>
       </w:r>
-      <w:bookmarkEnd w:id="12"/>
+      <w:bookmarkEnd w:id="11"/>
     </w:p>
     <w:p>
       <w:pPr>
@@ -2741,6 +2612,39 @@
     </w:p>
     <w:p>
       <w:pPr>
+        <w:spacing w:after="0"/>
+        <w:rPr>
+          <w:rFonts w:asciiTheme="majorHAnsi" w:hAnsiTheme="majorHAnsi" w:cstheme="majorHAnsi"/>
+          <w:color w:val="1F4E79" w:themeColor="accent5" w:themeShade="80"/>
+          <w:sz w:val="24"/>
+          <w:szCs w:val="24"/>
+        </w:rPr>
+      </w:pPr>
+    </w:p>
+    <w:p>
+      <w:pPr>
+        <w:spacing w:after="0"/>
+        <w:rPr>
+          <w:rFonts w:asciiTheme="majorHAnsi" w:hAnsiTheme="majorHAnsi" w:cstheme="majorHAnsi"/>
+          <w:color w:val="1F4E79" w:themeColor="accent5" w:themeShade="80"/>
+          <w:sz w:val="24"/>
+          <w:szCs w:val="24"/>
+        </w:rPr>
+      </w:pPr>
+    </w:p>
+    <w:p>
+      <w:pPr>
+        <w:spacing w:after="0"/>
+        <w:rPr>
+          <w:rFonts w:asciiTheme="majorHAnsi" w:hAnsiTheme="majorHAnsi" w:cstheme="majorHAnsi"/>
+          <w:color w:val="1F4E79" w:themeColor="accent5" w:themeShade="80"/>
+          <w:sz w:val="24"/>
+          <w:szCs w:val="24"/>
+        </w:rPr>
+      </w:pPr>
+    </w:p>
+    <w:p>
+      <w:pPr>
         <w:rPr>
           <w:b/>
         </w:rPr>
@@ -2766,6 +2670,7 @@
           <w:bCs w:val="0"/>
         </w:rPr>
       </w:pPr>
+      <w:bookmarkStart w:id="12" w:name="_GoBack"/>
       <w:r>
         <w:t>Peak Index in a Mountain Array (852)</w:t>
       </w:r>
@@ -2778,6 +2683,7 @@
       </w:r>
       <w:proofErr w:type="spellEnd"/>
     </w:p>
+    <w:bookmarkEnd w:id="12"/>
     <w:p>
       <w:pPr>
         <w:numPr>
@@ -8186,6 +8092,8 @@
       <w:r>
         <w:rPr>
           <w:b/>
+          <w:noProof/>
+          <w:lang w:eastAsia="en-IN"/>
         </w:rPr>
         <w:drawing>
           <wp:anchor distT="0" distB="0" distL="114300" distR="114300" simplePos="0" relativeHeight="251659264" behindDoc="0" locked="0" layoutInCell="1" allowOverlap="1" wp14:anchorId="1ED66533" wp14:editId="2999D872">
@@ -10266,6 +10174,8 @@
       <w:r>
         <w:rPr>
           <w:b/>
+          <w:noProof/>
+          <w:lang w:eastAsia="en-IN"/>
         </w:rPr>
         <w:drawing>
           <wp:anchor distT="0" distB="0" distL="114300" distR="114300" simplePos="0" relativeHeight="251661312" behindDoc="0" locked="0" layoutInCell="1" allowOverlap="1" wp14:anchorId="6EAA017C" wp14:editId="0B07EBA9">
@@ -18437,8 +18347,6 @@
         </w:rPr>
         <w:t xml:space="preserve"> equal for only one element array</w:t>
       </w:r>
-      <w:bookmarkStart w:id="17" w:name="_GoBack"/>
-      <w:bookmarkEnd w:id="17"/>
     </w:p>
     <w:p>
       <w:pPr>
@@ -20997,10 +20905,6 @@
     <w:p>
       <w:pPr>
         <w:pStyle w:val="Header"/>
-        <w:numPr>
-          <w:ilvl w:val="0"/>
-          <w:numId w:val="7"/>
-        </w:numPr>
         <w:tabs>
           <w:tab w:val="clear" w:pos="4513"/>
           <w:tab w:val="clear" w:pos="9026"/>
@@ -21011,55 +20915,189 @@
           <w:b/>
         </w:rPr>
       </w:pPr>
-      <w:r>
+    </w:p>
+    <w:p>
+      <w:pPr>
+        <w:pStyle w:val="Header"/>
+        <w:tabs>
+          <w:tab w:val="clear" w:pos="4513"/>
+          <w:tab w:val="clear" w:pos="9026"/>
+        </w:tabs>
+        <w:spacing w:line="259" w:lineRule="auto"/>
         <w:rPr>
           <w:rFonts w:asciiTheme="majorHAnsi" w:hAnsiTheme="majorHAnsi" w:cstheme="majorHAnsi"/>
           <w:b/>
         </w:rPr>
-        <w:br w:type="page"/>
-      </w:r>
-    </w:p>
-    <w:p>
-      <w:pPr>
-        <w:pStyle w:val="Heading2"/>
-        <w:rPr>
+      </w:pPr>
+    </w:p>
+    <w:p>
+      <w:pPr>
+        <w:pStyle w:val="Header"/>
+        <w:tabs>
+          <w:tab w:val="clear" w:pos="4513"/>
+          <w:tab w:val="clear" w:pos="9026"/>
+        </w:tabs>
+        <w:spacing w:line="259" w:lineRule="auto"/>
+        <w:rPr>
+          <w:rFonts w:asciiTheme="majorHAnsi" w:hAnsiTheme="majorHAnsi" w:cstheme="majorHAnsi"/>
           <w:b/>
-          <w:sz w:val="36"/>
-        </w:rPr>
-      </w:pPr>
-      <w:bookmarkStart w:id="18" w:name="_Toc207697060"/>
-      <w:r>
-        <w:rPr>
+        </w:rPr>
+      </w:pPr>
+    </w:p>
+    <w:p>
+      <w:pPr>
+        <w:pStyle w:val="Header"/>
+        <w:tabs>
+          <w:tab w:val="clear" w:pos="4513"/>
+          <w:tab w:val="clear" w:pos="9026"/>
+        </w:tabs>
+        <w:spacing w:line="259" w:lineRule="auto"/>
+        <w:rPr>
+          <w:rFonts w:asciiTheme="majorHAnsi" w:hAnsiTheme="majorHAnsi" w:cstheme="majorHAnsi"/>
           <w:b/>
-          <w:sz w:val="36"/>
-        </w:rPr>
-        <w:lastRenderedPageBreak/>
-        <w:t xml:space="preserve">LEVEL </w:t>
-      </w:r>
-      <w:r>
-        <w:rPr>
+        </w:rPr>
+      </w:pPr>
+    </w:p>
+    <w:p>
+      <w:pPr>
+        <w:pStyle w:val="Header"/>
+        <w:tabs>
+          <w:tab w:val="clear" w:pos="4513"/>
+          <w:tab w:val="clear" w:pos="9026"/>
+        </w:tabs>
+        <w:spacing w:line="259" w:lineRule="auto"/>
+        <w:rPr>
+          <w:rFonts w:asciiTheme="majorHAnsi" w:hAnsiTheme="majorHAnsi" w:cstheme="majorHAnsi"/>
           <w:b/>
-          <w:sz w:val="36"/>
-        </w:rPr>
-        <w:t>2</w:t>
-      </w:r>
-      <w:r>
-        <w:rPr>
+        </w:rPr>
+      </w:pPr>
+    </w:p>
+    <w:p>
+      <w:pPr>
+        <w:pStyle w:val="Header"/>
+        <w:tabs>
+          <w:tab w:val="clear" w:pos="4513"/>
+          <w:tab w:val="clear" w:pos="9026"/>
+        </w:tabs>
+        <w:spacing w:line="259" w:lineRule="auto"/>
+        <w:rPr>
+          <w:rFonts w:asciiTheme="majorHAnsi" w:hAnsiTheme="majorHAnsi" w:cstheme="majorHAnsi"/>
           <w:b/>
-          <w:sz w:val="36"/>
-        </w:rPr>
-        <w:t>:</w:t>
-      </w:r>
-      <w:bookmarkEnd w:id="18"/>
-      <w:r>
-        <w:rPr>
+        </w:rPr>
+      </w:pPr>
+    </w:p>
+    <w:p>
+      <w:pPr>
+        <w:pStyle w:val="Header"/>
+        <w:tabs>
+          <w:tab w:val="clear" w:pos="4513"/>
+          <w:tab w:val="clear" w:pos="9026"/>
+        </w:tabs>
+        <w:spacing w:line="259" w:lineRule="auto"/>
+        <w:rPr>
+          <w:rFonts w:asciiTheme="majorHAnsi" w:hAnsiTheme="majorHAnsi" w:cstheme="majorHAnsi"/>
           <w:b/>
-          <w:sz w:val="36"/>
-        </w:rPr>
-        <w:t xml:space="preserve"> </w:t>
-      </w:r>
-    </w:p>
-    <w:p/>
+        </w:rPr>
+      </w:pPr>
+    </w:p>
+    <w:p>
+      <w:pPr>
+        <w:pStyle w:val="Header"/>
+        <w:tabs>
+          <w:tab w:val="clear" w:pos="4513"/>
+          <w:tab w:val="clear" w:pos="9026"/>
+        </w:tabs>
+        <w:spacing w:line="259" w:lineRule="auto"/>
+        <w:rPr>
+          <w:rFonts w:asciiTheme="majorHAnsi" w:hAnsiTheme="majorHAnsi" w:cstheme="majorHAnsi"/>
+          <w:b/>
+        </w:rPr>
+      </w:pPr>
+    </w:p>
+    <w:p>
+      <w:pPr>
+        <w:pStyle w:val="Header"/>
+        <w:tabs>
+          <w:tab w:val="clear" w:pos="4513"/>
+          <w:tab w:val="clear" w:pos="9026"/>
+        </w:tabs>
+        <w:spacing w:line="259" w:lineRule="auto"/>
+        <w:rPr>
+          <w:rFonts w:asciiTheme="majorHAnsi" w:hAnsiTheme="majorHAnsi" w:cstheme="majorHAnsi"/>
+          <w:b/>
+        </w:rPr>
+      </w:pPr>
+    </w:p>
+    <w:p>
+      <w:pPr>
+        <w:pStyle w:val="Header"/>
+        <w:tabs>
+          <w:tab w:val="clear" w:pos="4513"/>
+          <w:tab w:val="clear" w:pos="9026"/>
+        </w:tabs>
+        <w:spacing w:line="259" w:lineRule="auto"/>
+        <w:rPr>
+          <w:rFonts w:asciiTheme="majorHAnsi" w:hAnsiTheme="majorHAnsi" w:cstheme="majorHAnsi"/>
+          <w:b/>
+        </w:rPr>
+      </w:pPr>
+    </w:p>
+    <w:p>
+      <w:pPr>
+        <w:pStyle w:val="Header"/>
+        <w:tabs>
+          <w:tab w:val="clear" w:pos="4513"/>
+          <w:tab w:val="clear" w:pos="9026"/>
+        </w:tabs>
+        <w:spacing w:line="259" w:lineRule="auto"/>
+        <w:rPr>
+          <w:rFonts w:asciiTheme="majorHAnsi" w:hAnsiTheme="majorHAnsi" w:cstheme="majorHAnsi"/>
+          <w:b/>
+        </w:rPr>
+      </w:pPr>
+    </w:p>
+    <w:p>
+      <w:pPr>
+        <w:pStyle w:val="Header"/>
+        <w:tabs>
+          <w:tab w:val="clear" w:pos="4513"/>
+          <w:tab w:val="clear" w:pos="9026"/>
+        </w:tabs>
+        <w:spacing w:line="259" w:lineRule="auto"/>
+        <w:rPr>
+          <w:rFonts w:asciiTheme="majorHAnsi" w:hAnsiTheme="majorHAnsi" w:cstheme="majorHAnsi"/>
+          <w:b/>
+        </w:rPr>
+      </w:pPr>
+    </w:p>
+    <w:p>
+      <w:pPr>
+        <w:pStyle w:val="Header"/>
+        <w:tabs>
+          <w:tab w:val="clear" w:pos="4513"/>
+          <w:tab w:val="clear" w:pos="9026"/>
+        </w:tabs>
+        <w:spacing w:line="259" w:lineRule="auto"/>
+        <w:rPr>
+          <w:rFonts w:asciiTheme="majorHAnsi" w:hAnsiTheme="majorHAnsi" w:cstheme="majorHAnsi"/>
+          <w:b/>
+        </w:rPr>
+      </w:pPr>
+    </w:p>
+    <w:p>
+      <w:pPr>
+        <w:pStyle w:val="Header"/>
+        <w:tabs>
+          <w:tab w:val="clear" w:pos="4513"/>
+          <w:tab w:val="clear" w:pos="9026"/>
+        </w:tabs>
+        <w:spacing w:line="259" w:lineRule="auto"/>
+        <w:rPr>
+          <w:rFonts w:asciiTheme="majorHAnsi" w:hAnsiTheme="majorHAnsi" w:cstheme="majorHAnsi"/>
+          <w:b/>
+        </w:rPr>
+      </w:pPr>
+    </w:p>
     <w:p>
       <w:pPr>
         <w:rPr>
@@ -21072,7 +21110,8 @@
           <w:b/>
           <w:sz w:val="28"/>
         </w:rPr>
-        <w:t>1</w:t>
+        <w:lastRenderedPageBreak/>
+        <w:t>8</w:t>
       </w:r>
       <w:r>
         <w:rPr>
@@ -21086,21 +21125,7 @@
           <w:b/>
           <w:sz w:val="28"/>
         </w:rPr>
-        <w:t xml:space="preserve"> </w:t>
-      </w:r>
-      <w:r>
-        <w:rPr>
-          <w:b/>
-          <w:sz w:val="28"/>
-        </w:rPr>
-        <w:t>Find Pea</w:t>
-      </w:r>
-      <w:r>
-        <w:rPr>
-          <w:b/>
-          <w:sz w:val="28"/>
-        </w:rPr>
-        <w:t>k Element</w:t>
+        <w:t xml:space="preserve"> Find Peak Element</w:t>
       </w:r>
     </w:p>
     <w:p>
@@ -21521,7 +21546,7 @@
           <w:lang w:eastAsia="en-IN"/>
         </w:rPr>
         <w:drawing>
-          <wp:inline distT="0" distB="0" distL="0" distR="0" wp14:anchorId="1FDC198D" wp14:editId="66974B0A">
+          <wp:inline distT="0" distB="0" distL="0" distR="0" wp14:anchorId="1846909F" wp14:editId="6626D80F">
             <wp:extent cx="2631881" cy="1750526"/>
             <wp:effectExtent l="0" t="0" r="0" b="2540"/>
             <wp:docPr id="5" name="Picture 5"/>
@@ -23734,7 +23759,6 @@
         <w:spacing w:after="160" w:line="259" w:lineRule="auto"/>
       </w:pPr>
       <w:r>
-        <w:lastRenderedPageBreak/>
         <w:t xml:space="preserve">Explanation: </w:t>
       </w:r>
     </w:p>
@@ -23752,6 +23776,7 @@
         <w:spacing w:after="240" w:line="259" w:lineRule="auto"/>
       </w:pPr>
       <w:r>
+        <w:lastRenderedPageBreak/>
         <w:t>Here at start we check for elements at first and last index, if they are greater than their single respective neighbours, return them as answers</w:t>
       </w:r>
     </w:p>
@@ -23811,13 +23836,7 @@
         <w:spacing w:after="240" w:line="259" w:lineRule="auto"/>
       </w:pPr>
       <w:r>
-        <w:t xml:space="preserve">Else if it is smaller than left neighbour, that means larger values are in </w:t>
-      </w:r>
-      <w:r>
-        <w:t>left side array, just check there. Remember though it is also possible to still have peak on right side, but that case is one with multiple peaks, so just check one side.</w:t>
-      </w:r>
-      <w:r>
-        <w:t xml:space="preserve"> </w:t>
+        <w:t xml:space="preserve">Else if it is smaller than left neighbour, that means larger values are in left side array, just check there. Remember though it is also possible to still have peak on right side, but that case is one with multiple peaks, so just check one side. </w:t>
       </w:r>
     </w:p>
     <w:p>
@@ -25115,6 +25134,10 @@
           <w:tab w:val="clear" w:pos="9026"/>
         </w:tabs>
         <w:spacing w:line="259" w:lineRule="auto"/>
+        <w:rPr>
+          <w:rFonts w:asciiTheme="majorHAnsi" w:hAnsiTheme="majorHAnsi" w:cstheme="majorHAnsi"/>
+          <w:b/>
+        </w:rPr>
       </w:pPr>
     </w:p>
     <w:p>
@@ -25125,6 +25148,10 @@
           <w:tab w:val="clear" w:pos="9026"/>
         </w:tabs>
         <w:spacing w:line="259" w:lineRule="auto"/>
+        <w:rPr>
+          <w:rFonts w:asciiTheme="majorHAnsi" w:hAnsiTheme="majorHAnsi" w:cstheme="majorHAnsi"/>
+          <w:b/>
+        </w:rPr>
       </w:pPr>
     </w:p>
     <w:p>
@@ -25135,7 +25162,58 @@
           <w:tab w:val="clear" w:pos="9026"/>
         </w:tabs>
         <w:spacing w:line="259" w:lineRule="auto"/>
-      </w:pPr>
+        <w:rPr>
+          <w:rFonts w:asciiTheme="majorHAnsi" w:hAnsiTheme="majorHAnsi" w:cstheme="majorHAnsi"/>
+          <w:b/>
+        </w:rPr>
+      </w:pPr>
+      <w:r>
+        <w:rPr>
+          <w:rFonts w:asciiTheme="majorHAnsi" w:hAnsiTheme="majorHAnsi" w:cstheme="majorHAnsi"/>
+          <w:b/>
+        </w:rPr>
+        <w:br w:type="page"/>
+      </w:r>
+    </w:p>
+    <w:p>
+      <w:pPr>
+        <w:pStyle w:val="Heading2"/>
+        <w:rPr>
+          <w:b/>
+          <w:sz w:val="36"/>
+        </w:rPr>
+      </w:pPr>
+      <w:bookmarkStart w:id="17" w:name="_Toc207697060"/>
+      <w:r>
+        <w:rPr>
+          <w:b/>
+          <w:sz w:val="36"/>
+        </w:rPr>
+        <w:lastRenderedPageBreak/>
+        <w:t xml:space="preserve">LEVEL </w:t>
+      </w:r>
+      <w:r>
+        <w:rPr>
+          <w:b/>
+          <w:sz w:val="36"/>
+        </w:rPr>
+        <w:t>2</w:t>
+      </w:r>
+      <w:r>
+        <w:rPr>
+          <w:b/>
+          <w:sz w:val="36"/>
+        </w:rPr>
+        <w:t>:</w:t>
+      </w:r>
+      <w:bookmarkEnd w:id="17"/>
+      <w:r>
+        <w:rPr>
+          <w:b/>
+          <w:sz w:val="36"/>
+        </w:rPr>
+        <w:t xml:space="preserve"> </w:t>
+      </w:r>
     </w:p>
     <w:p>
       <w:pPr>
@@ -25159,46 +25237,6 @@
     </w:p>
     <w:p>
       <w:pPr>
-        <w:pStyle w:val="Header"/>
-        <w:tabs>
-          <w:tab w:val="clear" w:pos="4513"/>
-          <w:tab w:val="clear" w:pos="9026"/>
-        </w:tabs>
-        <w:spacing w:line="259" w:lineRule="auto"/>
-      </w:pPr>
-    </w:p>
-    <w:p>
-      <w:pPr>
-        <w:pStyle w:val="Header"/>
-        <w:tabs>
-          <w:tab w:val="clear" w:pos="4513"/>
-          <w:tab w:val="clear" w:pos="9026"/>
-        </w:tabs>
-        <w:spacing w:line="259" w:lineRule="auto"/>
-      </w:pPr>
-    </w:p>
-    <w:p>
-      <w:pPr>
-        <w:pStyle w:val="Header"/>
-        <w:tabs>
-          <w:tab w:val="clear" w:pos="4513"/>
-          <w:tab w:val="clear" w:pos="9026"/>
-        </w:tabs>
-        <w:spacing w:line="259" w:lineRule="auto"/>
-      </w:pPr>
-    </w:p>
-    <w:p>
-      <w:pPr>
-        <w:pStyle w:val="Header"/>
-        <w:tabs>
-          <w:tab w:val="clear" w:pos="4513"/>
-          <w:tab w:val="clear" w:pos="9026"/>
-        </w:tabs>
-        <w:spacing w:line="259" w:lineRule="auto"/>
-      </w:pPr>
-    </w:p>
-    <w:p>
-      <w:pPr>
         <w:rPr>
           <w:b/>
           <w:sz w:val="28"/>
@@ -25209,7 +25247,6 @@
           <w:b/>
           <w:sz w:val="28"/>
         </w:rPr>
-        <w:lastRenderedPageBreak/>
         <w:t>2</w:t>
       </w:r>
       <w:r>
@@ -26678,7 +26715,6 @@
           <w:b/>
           <w:sz w:val="28"/>
         </w:rPr>
-        <w:lastRenderedPageBreak/>
         <w:t>3. Allocate Minimum Pages</w:t>
       </w:r>
     </w:p>
@@ -29255,6 +29291,7 @@
         <w:spacing w:after="0"/>
       </w:pPr>
       <w:r>
+        <w:lastRenderedPageBreak/>
         <w:t xml:space="preserve">The approach uses </w:t>
       </w:r>
       <w:r>
@@ -29291,7 +29328,6 @@
           <w:noProof/>
           <w:lang w:eastAsia="en-IN"/>
         </w:rPr>
-        <w:lastRenderedPageBreak/>
         <w:drawing>
           <wp:inline distT="0" distB="0" distL="0" distR="0" wp14:anchorId="76F01188" wp14:editId="1AF0485D">
             <wp:extent cx="6645910" cy="2950845"/>
@@ -30820,6 +30856,7 @@
           <w:szCs w:val="21"/>
           <w:lang w:eastAsia="en-IN"/>
         </w:rPr>
+        <w:lastRenderedPageBreak/>
         <w:t xml:space="preserve">                </w:t>
       </w:r>
       <w:proofErr w:type="spellStart"/>
@@ -31137,7 +31174,6 @@
           <w:b/>
           <w:bCs/>
         </w:rPr>
-        <w:lastRenderedPageBreak/>
         <w:t>Approach</w:t>
       </w:r>
       <w:proofErr w:type="gramStart"/>
@@ -33326,7 +33362,7 @@
         <w:noProof/>
         <w:color w:val="404040" w:themeColor="text1" w:themeTint="BF"/>
       </w:rPr>
-      <w:t>17</w:t>
+      <w:t>18</w:t>
     </w:r>
     <w:r>
       <w:rPr>
@@ -35570,6 +35606,7 @@
   <w:style w:type="character" w:default="1" w:styleId="DefaultParagraphFont">
     <w:name w:val="Default Paragraph Font"/>
     <w:uiPriority w:val="1"/>
+    <w:semiHidden/>
     <w:unhideWhenUsed/>
   </w:style>
   <w:style w:type="table" w:default="1" w:styleId="TableNormal">
@@ -36365,7 +36402,7 @@
 </file>
 
 <file path=customXml/itemProps1.xml><?xml version="1.0" encoding="utf-8"?>
-<ds:datastoreItem xmlns:ds="http://schemas.openxmlformats.org/officeDocument/2006/customXml" ds:itemID="{EAE0320C-1F82-4D8E-853E-DB4F50627575}">
+<ds:datastoreItem xmlns:ds="http://schemas.openxmlformats.org/officeDocument/2006/customXml" ds:itemID="{4AF7FCAC-22CB-43B7-AD6A-D48A5C9E0CD3}">
   <ds:schemaRefs>
     <ds:schemaRef ds:uri="http://schemas.openxmlformats.org/officeDocument/2006/bibliography"/>
   </ds:schemaRefs>

</xml_diff>